<commit_message>
docx 헤딩 표준 스타일 적용 + bullet/numbered 처리
- add_heading()에 doc.styles['Heading X'] 적용
  → grep false positive 제거 + Word TOC 자동 인식
- convert_md()에 - / N. 마크다운 리스트 → List Bullet/Number 스타일 변환

검증 결과:
- 본문 raw markdown (bold·heading·image·link·code·fence): 0건
- numbered "1." 51건은 모두 Heading 3 스타일로 정상
- bullet "- " 본문 raw: 0건

Co-Authored-By: Claude Opus 4.7 <noreply@anthropic.com>
</commit_message>
<xml_diff>
--- a/paper/논문_초안_v8.docx
+++ b/paper/논문_초안_v8.docx
@@ -429,6 +429,7 @@
     </w:p>
     <w:p>
       <w:pPr>
+        <w:pStyle w:val="Heading1"/>
         <w:spacing w:before="480" w:after="360"/>
         <w:ind w:firstLine="0"/>
         <w:jc w:val="center"/>
@@ -699,6 +700,7 @@
     </w:p>
     <w:p>
       <w:pPr>
+        <w:pStyle w:val="Heading1"/>
         <w:spacing w:before="480" w:after="360"/>
         <w:ind w:firstLine="0"/>
         <w:jc w:val="center"/>
@@ -713,47 +715,64 @@
       </w:r>
     </w:p>
     <w:p>
+      <w:pPr>
+        <w:pStyle w:val="ListBullet"/>
+        <w:ind w:firstLine="0"/>
+      </w:pPr>
       <w:r>
         <w:rPr>
           <w:rFonts w:ascii="바탕" w:hAnsi="바탕" w:eastAsia="바탕"/>
           <w:b w:val="0"/>
           <w:sz w:val="22"/>
         </w:rPr>
-        <w:t>- 국문초록</w:t>
-      </w:r>
-    </w:p>
-    <w:p>
-      <w:r>
-        <w:rPr>
-          <w:rFonts w:ascii="바탕" w:hAnsi="바탕" w:eastAsia="바탕"/>
-          <w:b w:val="0"/>
-          <w:sz w:val="22"/>
-        </w:rPr>
-        <w:t>- 목차</w:t>
-      </w:r>
-    </w:p>
-    <w:p>
-      <w:r>
-        <w:rPr>
-          <w:rFonts w:ascii="바탕" w:hAnsi="바탕" w:eastAsia="바탕"/>
-          <w:b w:val="0"/>
-          <w:sz w:val="22"/>
-        </w:rPr>
-        <w:t>- 표 목차</w:t>
-      </w:r>
-    </w:p>
-    <w:p>
-      <w:r>
-        <w:rPr>
-          <w:rFonts w:ascii="바탕" w:hAnsi="바탕" w:eastAsia="바탕"/>
-          <w:b w:val="0"/>
-          <w:sz w:val="22"/>
-        </w:rPr>
-        <w:t>- 그림 목차</w:t>
+        <w:t>국문초록</w:t>
       </w:r>
     </w:p>
     <w:p>
       <w:pPr>
+        <w:pStyle w:val="ListBullet"/>
+        <w:ind w:firstLine="0"/>
+      </w:pPr>
+      <w:r>
+        <w:rPr>
+          <w:rFonts w:ascii="바탕" w:hAnsi="바탕" w:eastAsia="바탕"/>
+          <w:b w:val="0"/>
+          <w:sz w:val="22"/>
+        </w:rPr>
+        <w:t>목차</w:t>
+      </w:r>
+    </w:p>
+    <w:p>
+      <w:pPr>
+        <w:pStyle w:val="ListBullet"/>
+        <w:ind w:firstLine="0"/>
+      </w:pPr>
+      <w:r>
+        <w:rPr>
+          <w:rFonts w:ascii="바탕" w:hAnsi="바탕" w:eastAsia="바탕"/>
+          <w:b w:val="0"/>
+          <w:sz w:val="22"/>
+        </w:rPr>
+        <w:t>표 목차</w:t>
+      </w:r>
+    </w:p>
+    <w:p>
+      <w:pPr>
+        <w:pStyle w:val="ListBullet"/>
+        <w:ind w:firstLine="0"/>
+      </w:pPr>
+      <w:r>
+        <w:rPr>
+          <w:rFonts w:ascii="바탕" w:hAnsi="바탕" w:eastAsia="바탕"/>
+          <w:b w:val="0"/>
+          <w:sz w:val="22"/>
+        </w:rPr>
+        <w:t>그림 목차</w:t>
+      </w:r>
+    </w:p>
+    <w:p>
+      <w:pPr>
+        <w:pStyle w:val="Heading2"/>
         <w:spacing w:before="360" w:after="240"/>
         <w:ind w:firstLine="0"/>
         <w:jc w:val="left"/>
@@ -768,37 +787,50 @@
       </w:r>
     </w:p>
     <w:p>
+      <w:pPr>
+        <w:pStyle w:val="ListBullet"/>
+        <w:ind w:firstLine="0"/>
+      </w:pPr>
       <w:r>
         <w:rPr>
           <w:rFonts w:ascii="바탕" w:hAnsi="바탕" w:eastAsia="바탕"/>
           <w:b w:val="0"/>
           <w:sz w:val="22"/>
         </w:rPr>
-        <w:t>- 제1절 연구의 배경 및 목적</w:t>
-      </w:r>
-    </w:p>
-    <w:p>
-      <w:r>
-        <w:rPr>
-          <w:rFonts w:ascii="바탕" w:hAnsi="바탕" w:eastAsia="바탕"/>
-          <w:b w:val="0"/>
-          <w:sz w:val="22"/>
-        </w:rPr>
-        <w:t>- 제2절 연구의 범위 및 방법</w:t>
-      </w:r>
-    </w:p>
-    <w:p>
-      <w:r>
-        <w:rPr>
-          <w:rFonts w:ascii="바탕" w:hAnsi="바탕" w:eastAsia="바탕"/>
-          <w:b w:val="0"/>
-          <w:sz w:val="22"/>
-        </w:rPr>
-        <w:t>- 제3절 논문의 구성</w:t>
+        <w:t>제1절 연구의 배경 및 목적</w:t>
       </w:r>
     </w:p>
     <w:p>
       <w:pPr>
+        <w:pStyle w:val="ListBullet"/>
+        <w:ind w:firstLine="0"/>
+      </w:pPr>
+      <w:r>
+        <w:rPr>
+          <w:rFonts w:ascii="바탕" w:hAnsi="바탕" w:eastAsia="바탕"/>
+          <w:b w:val="0"/>
+          <w:sz w:val="22"/>
+        </w:rPr>
+        <w:t>제2절 연구의 범위 및 방법</w:t>
+      </w:r>
+    </w:p>
+    <w:p>
+      <w:pPr>
+        <w:pStyle w:val="ListBullet"/>
+        <w:ind w:firstLine="0"/>
+      </w:pPr>
+      <w:r>
+        <w:rPr>
+          <w:rFonts w:ascii="바탕" w:hAnsi="바탕" w:eastAsia="바탕"/>
+          <w:b w:val="0"/>
+          <w:sz w:val="22"/>
+        </w:rPr>
+        <w:t>제3절 논문의 구성</w:t>
+      </w:r>
+    </w:p>
+    <w:p>
+      <w:pPr>
+        <w:pStyle w:val="Heading2"/>
         <w:spacing w:before="360" w:after="240"/>
         <w:ind w:firstLine="0"/>
         <w:jc w:val="left"/>
@@ -813,47 +845,64 @@
       </w:r>
     </w:p>
     <w:p>
+      <w:pPr>
+        <w:pStyle w:val="ListBullet"/>
+        <w:ind w:firstLine="0"/>
+      </w:pPr>
       <w:r>
         <w:rPr>
           <w:rFonts w:ascii="바탕" w:hAnsi="바탕" w:eastAsia="바탕"/>
           <w:b w:val="0"/>
           <w:sz w:val="22"/>
         </w:rPr>
-        <w:t>- 제1절 헤도닉 가격모형</w:t>
-      </w:r>
-    </w:p>
-    <w:p>
-      <w:r>
-        <w:rPr>
-          <w:rFonts w:ascii="바탕" w:hAnsi="바탕" w:eastAsia="바탕"/>
-          <w:b w:val="0"/>
-          <w:sz w:val="22"/>
-        </w:rPr>
-        <w:t>- 제2절 머신러닝 기반 부동산 가격 예측</w:t>
-      </w:r>
-    </w:p>
-    <w:p>
-      <w:r>
-        <w:rPr>
-          <w:rFonts w:ascii="바탕" w:hAnsi="바탕" w:eastAsia="바탕"/>
-          <w:b w:val="0"/>
-          <w:sz w:val="22"/>
-        </w:rPr>
-        <w:t>- 제3절 설명가능한 인공지능(XAI)</w:t>
-      </w:r>
-    </w:p>
-    <w:p>
-      <w:r>
-        <w:rPr>
-          <w:rFonts w:ascii="바탕" w:hAnsi="바탕" w:eastAsia="바탕"/>
-          <w:b w:val="0"/>
-          <w:sz w:val="22"/>
-        </w:rPr>
-        <w:t>- 제4절 선행연구 검토 및 차별성</w:t>
+        <w:t>제1절 헤도닉 가격모형</w:t>
       </w:r>
     </w:p>
     <w:p>
       <w:pPr>
+        <w:pStyle w:val="ListBullet"/>
+        <w:ind w:firstLine="0"/>
+      </w:pPr>
+      <w:r>
+        <w:rPr>
+          <w:rFonts w:ascii="바탕" w:hAnsi="바탕" w:eastAsia="바탕"/>
+          <w:b w:val="0"/>
+          <w:sz w:val="22"/>
+        </w:rPr>
+        <w:t>제2절 머신러닝 기반 부동산 가격 예측</w:t>
+      </w:r>
+    </w:p>
+    <w:p>
+      <w:pPr>
+        <w:pStyle w:val="ListBullet"/>
+        <w:ind w:firstLine="0"/>
+      </w:pPr>
+      <w:r>
+        <w:rPr>
+          <w:rFonts w:ascii="바탕" w:hAnsi="바탕" w:eastAsia="바탕"/>
+          <w:b w:val="0"/>
+          <w:sz w:val="22"/>
+        </w:rPr>
+        <w:t>제3절 설명가능한 인공지능(XAI)</w:t>
+      </w:r>
+    </w:p>
+    <w:p>
+      <w:pPr>
+        <w:pStyle w:val="ListBullet"/>
+        <w:ind w:firstLine="0"/>
+      </w:pPr>
+      <w:r>
+        <w:rPr>
+          <w:rFonts w:ascii="바탕" w:hAnsi="바탕" w:eastAsia="바탕"/>
+          <w:b w:val="0"/>
+          <w:sz w:val="22"/>
+        </w:rPr>
+        <w:t>제4절 선행연구 검토 및 차별성</w:t>
+      </w:r>
+    </w:p>
+    <w:p>
+      <w:pPr>
+        <w:pStyle w:val="Heading2"/>
         <w:spacing w:before="360" w:after="240"/>
         <w:ind w:firstLine="0"/>
         <w:jc w:val="left"/>
@@ -868,37 +917,50 @@
       </w:r>
     </w:p>
     <w:p>
+      <w:pPr>
+        <w:pStyle w:val="ListBullet"/>
+        <w:ind w:firstLine="0"/>
+      </w:pPr>
       <w:r>
         <w:rPr>
           <w:rFonts w:ascii="바탕" w:hAnsi="바탕" w:eastAsia="바탕"/>
           <w:b w:val="0"/>
           <w:sz w:val="22"/>
         </w:rPr>
-        <w:t>- 제1절 연구 모형</w:t>
-      </w:r>
-    </w:p>
-    <w:p>
-      <w:r>
-        <w:rPr>
-          <w:rFonts w:ascii="바탕" w:hAnsi="바탕" w:eastAsia="바탕"/>
-          <w:b w:val="0"/>
-          <w:sz w:val="22"/>
-        </w:rPr>
-        <w:t>- 제2절 분석 데이터 및 변수 설정</w:t>
-      </w:r>
-    </w:p>
-    <w:p>
-      <w:r>
-        <w:rPr>
-          <w:rFonts w:ascii="바탕" w:hAnsi="바탕" w:eastAsia="바탕"/>
-          <w:b w:val="0"/>
-          <w:sz w:val="22"/>
-        </w:rPr>
-        <w:t>- 제3절 분석 방법</w:t>
+        <w:t>제1절 연구 모형</w:t>
       </w:r>
     </w:p>
     <w:p>
       <w:pPr>
+        <w:pStyle w:val="ListBullet"/>
+        <w:ind w:firstLine="0"/>
+      </w:pPr>
+      <w:r>
+        <w:rPr>
+          <w:rFonts w:ascii="바탕" w:hAnsi="바탕" w:eastAsia="바탕"/>
+          <w:b w:val="0"/>
+          <w:sz w:val="22"/>
+        </w:rPr>
+        <w:t>제2절 분석 데이터 및 변수 설정</w:t>
+      </w:r>
+    </w:p>
+    <w:p>
+      <w:pPr>
+        <w:pStyle w:val="ListBullet"/>
+        <w:ind w:firstLine="0"/>
+      </w:pPr>
+      <w:r>
+        <w:rPr>
+          <w:rFonts w:ascii="바탕" w:hAnsi="바탕" w:eastAsia="바탕"/>
+          <w:b w:val="0"/>
+          <w:sz w:val="22"/>
+        </w:rPr>
+        <w:t>제3절 분석 방법</w:t>
+      </w:r>
+    </w:p>
+    <w:p>
+      <w:pPr>
+        <w:pStyle w:val="Heading2"/>
         <w:spacing w:before="360" w:after="240"/>
         <w:ind w:firstLine="0"/>
         <w:jc w:val="left"/>
@@ -913,77 +975,106 @@
       </w:r>
     </w:p>
     <w:p>
+      <w:pPr>
+        <w:pStyle w:val="ListBullet"/>
+        <w:ind w:firstLine="0"/>
+      </w:pPr>
       <w:r>
         <w:rPr>
           <w:rFonts w:ascii="바탕" w:hAnsi="바탕" w:eastAsia="바탕"/>
           <w:b w:val="0"/>
           <w:sz w:val="22"/>
         </w:rPr>
-        <w:t>- 제1절 기술통계 및 변수 분포</w:t>
-      </w:r>
-    </w:p>
-    <w:p>
-      <w:r>
-        <w:rPr>
-          <w:rFonts w:ascii="바탕" w:hAnsi="바탕" w:eastAsia="바탕"/>
-          <w:b w:val="0"/>
-          <w:sz w:val="22"/>
-        </w:rPr>
-        <w:t>- 제2절 모형별 예측 성능 비교</w:t>
-      </w:r>
-    </w:p>
-    <w:p>
-      <w:r>
-        <w:rPr>
-          <w:rFonts w:ascii="바탕" w:hAnsi="바탕" w:eastAsia="바탕"/>
-          <w:b w:val="0"/>
-          <w:sz w:val="22"/>
-        </w:rPr>
-        <w:t>- 제3절 어블레이션 분석 — 공간 정합과 시간 정합의 정량 분해</w:t>
-      </w:r>
-    </w:p>
-    <w:p>
-      <w:r>
-        <w:rPr>
-          <w:rFonts w:ascii="바탕" w:hAnsi="바탕" w:eastAsia="바탕"/>
-          <w:b w:val="0"/>
-          <w:sz w:val="22"/>
-        </w:rPr>
-        <w:t>- 제4절 전체 SHAP 분석 — 가격 설명 신호의 글로벌 구조</w:t>
-      </w:r>
-    </w:p>
-    <w:p>
-      <w:r>
-        <w:rPr>
-          <w:rFonts w:ascii="바탕" w:hAnsi="바탕" w:eastAsia="바탕"/>
-          <w:b w:val="0"/>
-          <w:sz w:val="22"/>
-        </w:rPr>
-        <w:t>- 제5절 권역별 SHAP 분석 — 강남3구와 비강남의 구성 차이</w:t>
-      </w:r>
-    </w:p>
-    <w:p>
-      <w:r>
-        <w:rPr>
-          <w:rFonts w:ascii="바탕" w:hAnsi="바탕" w:eastAsia="바탕"/>
-          <w:b w:val="0"/>
-          <w:sz w:val="22"/>
-        </w:rPr>
-        <w:t>- 제6절 연도별 SHAP 분석 — 시장 국면별 설명 신호의 변동</w:t>
-      </w:r>
-    </w:p>
-    <w:p>
-      <w:r>
-        <w:rPr>
-          <w:rFonts w:ascii="바탕" w:hAnsi="바탕" w:eastAsia="바탕"/>
-          <w:b w:val="0"/>
-          <w:sz w:val="22"/>
-        </w:rPr>
-        <w:t>- 제7절 연도×권역 교차 SHAP 분석 — 시공간 이질성의 실증</w:t>
+        <w:t>제1절 기술통계 및 변수 분포</w:t>
       </w:r>
     </w:p>
     <w:p>
       <w:pPr>
+        <w:pStyle w:val="ListBullet"/>
+        <w:ind w:firstLine="0"/>
+      </w:pPr>
+      <w:r>
+        <w:rPr>
+          <w:rFonts w:ascii="바탕" w:hAnsi="바탕" w:eastAsia="바탕"/>
+          <w:b w:val="0"/>
+          <w:sz w:val="22"/>
+        </w:rPr>
+        <w:t>제2절 모형별 예측 성능 비교</w:t>
+      </w:r>
+    </w:p>
+    <w:p>
+      <w:pPr>
+        <w:pStyle w:val="ListBullet"/>
+        <w:ind w:firstLine="0"/>
+      </w:pPr>
+      <w:r>
+        <w:rPr>
+          <w:rFonts w:ascii="바탕" w:hAnsi="바탕" w:eastAsia="바탕"/>
+          <w:b w:val="0"/>
+          <w:sz w:val="22"/>
+        </w:rPr>
+        <w:t>제3절 어블레이션 분석 — 공간 정합과 시간 정합의 정량 분해</w:t>
+      </w:r>
+    </w:p>
+    <w:p>
+      <w:pPr>
+        <w:pStyle w:val="ListBullet"/>
+        <w:ind w:firstLine="0"/>
+      </w:pPr>
+      <w:r>
+        <w:rPr>
+          <w:rFonts w:ascii="바탕" w:hAnsi="바탕" w:eastAsia="바탕"/>
+          <w:b w:val="0"/>
+          <w:sz w:val="22"/>
+        </w:rPr>
+        <w:t>제4절 전체 SHAP 분석 — 가격 설명 신호의 글로벌 구조</w:t>
+      </w:r>
+    </w:p>
+    <w:p>
+      <w:pPr>
+        <w:pStyle w:val="ListBullet"/>
+        <w:ind w:firstLine="0"/>
+      </w:pPr>
+      <w:r>
+        <w:rPr>
+          <w:rFonts w:ascii="바탕" w:hAnsi="바탕" w:eastAsia="바탕"/>
+          <w:b w:val="0"/>
+          <w:sz w:val="22"/>
+        </w:rPr>
+        <w:t>제5절 권역별 SHAP 분석 — 강남3구와 비강남의 구성 차이</w:t>
+      </w:r>
+    </w:p>
+    <w:p>
+      <w:pPr>
+        <w:pStyle w:val="ListBullet"/>
+        <w:ind w:firstLine="0"/>
+      </w:pPr>
+      <w:r>
+        <w:rPr>
+          <w:rFonts w:ascii="바탕" w:hAnsi="바탕" w:eastAsia="바탕"/>
+          <w:b w:val="0"/>
+          <w:sz w:val="22"/>
+        </w:rPr>
+        <w:t>제6절 연도별 SHAP 분석 — 시장 국면별 설명 신호의 변동</w:t>
+      </w:r>
+    </w:p>
+    <w:p>
+      <w:pPr>
+        <w:pStyle w:val="ListBullet"/>
+        <w:ind w:firstLine="0"/>
+      </w:pPr>
+      <w:r>
+        <w:rPr>
+          <w:rFonts w:ascii="바탕" w:hAnsi="바탕" w:eastAsia="바탕"/>
+          <w:b w:val="0"/>
+          <w:sz w:val="22"/>
+        </w:rPr>
+        <w:t>제7절 연도×권역 교차 SHAP 분석 — 시공간 이질성의 실증</w:t>
+      </w:r>
+    </w:p>
+    <w:p>
+      <w:pPr>
+        <w:pStyle w:val="Heading2"/>
         <w:spacing w:before="360" w:after="240"/>
         <w:ind w:firstLine="0"/>
         <w:jc w:val="left"/>
@@ -998,62 +1089,83 @@
       </w:r>
     </w:p>
     <w:p>
+      <w:pPr>
+        <w:pStyle w:val="ListBullet"/>
+        <w:ind w:firstLine="0"/>
+      </w:pPr>
       <w:r>
         <w:rPr>
           <w:rFonts w:ascii="바탕" w:hAnsi="바탕" w:eastAsia="바탕"/>
           <w:b w:val="0"/>
           <w:sz w:val="22"/>
         </w:rPr>
-        <w:t>- 제1절 연구 결과 요약</w:t>
-      </w:r>
-    </w:p>
-    <w:p>
-      <w:r>
-        <w:rPr>
-          <w:rFonts w:ascii="바탕" w:hAnsi="바탕" w:eastAsia="바탕"/>
-          <w:b w:val="0"/>
-          <w:sz w:val="22"/>
-        </w:rPr>
-        <w:t>- 제2절 시사점</w:t>
-      </w:r>
-    </w:p>
-    <w:p>
-      <w:r>
-        <w:rPr>
-          <w:rFonts w:ascii="바탕" w:hAnsi="바탕" w:eastAsia="바탕"/>
-          <w:b w:val="0"/>
-          <w:sz w:val="22"/>
-        </w:rPr>
-        <w:t>- 제3절 연구의 한계 및 향후 과제</w:t>
-      </w:r>
-    </w:p>
-    <w:p>
-      <w:r>
-        <w:rPr>
-          <w:rFonts w:ascii="바탕" w:hAnsi="바탕" w:eastAsia="바탕"/>
-          <w:b w:val="0"/>
-          <w:sz w:val="22"/>
-        </w:rPr>
-        <w:t>- 참고문헌</w:t>
-      </w:r>
-    </w:p>
-    <w:p>
-      <w:r>
-        <w:rPr>
-          <w:rFonts w:ascii="바탕" w:hAnsi="바탕" w:eastAsia="바탕"/>
-          <w:b w:val="0"/>
-          <w:sz w:val="22"/>
-        </w:rPr>
-        <w:t>- Abstract</w:t>
-      </w:r>
-    </w:p>
-    <w:p>
-      <w:r>
-        <w:br w:type="page"/>
+        <w:t>제1절 연구 결과 요약</w:t>
       </w:r>
     </w:p>
     <w:p>
       <w:pPr>
+        <w:pStyle w:val="ListBullet"/>
+        <w:ind w:firstLine="0"/>
+      </w:pPr>
+      <w:r>
+        <w:rPr>
+          <w:rFonts w:ascii="바탕" w:hAnsi="바탕" w:eastAsia="바탕"/>
+          <w:b w:val="0"/>
+          <w:sz w:val="22"/>
+        </w:rPr>
+        <w:t>제2절 시사점</w:t>
+      </w:r>
+    </w:p>
+    <w:p>
+      <w:pPr>
+        <w:pStyle w:val="ListBullet"/>
+        <w:ind w:firstLine="0"/>
+      </w:pPr>
+      <w:r>
+        <w:rPr>
+          <w:rFonts w:ascii="바탕" w:hAnsi="바탕" w:eastAsia="바탕"/>
+          <w:b w:val="0"/>
+          <w:sz w:val="22"/>
+        </w:rPr>
+        <w:t>제3절 연구의 한계 및 향후 과제</w:t>
+      </w:r>
+    </w:p>
+    <w:p>
+      <w:pPr>
+        <w:pStyle w:val="ListBullet"/>
+        <w:ind w:firstLine="0"/>
+      </w:pPr>
+      <w:r>
+        <w:rPr>
+          <w:rFonts w:ascii="바탕" w:hAnsi="바탕" w:eastAsia="바탕"/>
+          <w:b w:val="0"/>
+          <w:sz w:val="22"/>
+        </w:rPr>
+        <w:t>참고문헌</w:t>
+      </w:r>
+    </w:p>
+    <w:p>
+      <w:pPr>
+        <w:pStyle w:val="ListBullet"/>
+        <w:ind w:firstLine="0"/>
+      </w:pPr>
+      <w:r>
+        <w:rPr>
+          <w:rFonts w:ascii="바탕" w:hAnsi="바탕" w:eastAsia="바탕"/>
+          <w:b w:val="0"/>
+          <w:sz w:val="22"/>
+        </w:rPr>
+        <w:t>Abstract</w:t>
+      </w:r>
+    </w:p>
+    <w:p>
+      <w:r>
+        <w:br w:type="page"/>
+      </w:r>
+    </w:p>
+    <w:p>
+      <w:pPr>
+        <w:pStyle w:val="Heading1"/>
         <w:spacing w:before="480" w:after="360"/>
         <w:ind w:firstLine="0"/>
         <w:jc w:val="center"/>
@@ -1069,6 +1181,7 @@
     </w:p>
     <w:p>
       <w:pPr>
+        <w:pStyle w:val="Heading1"/>
         <w:spacing w:before="480" w:after="360"/>
         <w:ind w:firstLine="0"/>
         <w:jc w:val="center"/>
@@ -1094,6 +1207,7 @@
     </w:p>
     <w:p>
       <w:pPr>
+        <w:pStyle w:val="Heading1"/>
         <w:spacing w:before="480" w:after="360"/>
         <w:ind w:firstLine="0"/>
         <w:jc w:val="center"/>
@@ -1109,6 +1223,7 @@
     </w:p>
     <w:p>
       <w:pPr>
+        <w:pStyle w:val="Heading2"/>
         <w:spacing w:before="360" w:after="240"/>
         <w:ind w:firstLine="0"/>
         <w:jc w:val="left"/>
@@ -1124,6 +1239,7 @@
     </w:p>
     <w:p>
       <w:pPr>
+        <w:pStyle w:val="Heading3"/>
         <w:spacing w:before="240" w:after="160"/>
         <w:ind w:firstLine="0"/>
         <w:jc w:val="left"/>
@@ -1332,175 +1448,160 @@
       </w:r>
     </w:p>
     <w:p>
+      <w:pPr>
+        <w:pStyle w:val="ListNumber"/>
+        <w:ind w:firstLine="0"/>
+      </w:pPr>
+      <w:r>
+        <w:rPr>
+          <w:rFonts w:ascii="바탕" w:hAnsi="바탕" w:eastAsia="바탕"/>
+          <w:b/>
+          <w:sz w:val="22"/>
+        </w:rPr>
+        <w:t>종속변수 정규화</w:t>
+      </w:r>
       <w:r>
         <w:rPr>
           <w:rFonts w:ascii="바탕" w:hAnsi="바탕" w:eastAsia="바탕"/>
           <w:b w:val="0"/>
           <w:sz w:val="22"/>
         </w:rPr>
-        <w:t xml:space="preserve">1. </w:t>
-      </w:r>
-      <w:r>
-        <w:rPr>
-          <w:rFonts w:ascii="바탕" w:hAnsi="바탕" w:eastAsia="바탕"/>
-          <w:b/>
-          <w:sz w:val="22"/>
-        </w:rPr>
-        <w:t>종속변수 정규화</w:t>
-      </w:r>
-      <w:r>
-        <w:rPr>
-          <w:rFonts w:ascii="바탕" w:hAnsi="바탕" w:eastAsia="바탕"/>
-          <w:b w:val="0"/>
-          <w:sz w:val="22"/>
-        </w:rPr>
         <w:t>: 단위면적당 가격(log ㎡당 만원)을 종속변수로 사용하여 규모효과를 분리하고, 질적·입지적 설명 신호를 드러낸다.</w:t>
-      </w:r>
-    </w:p>
-    <w:p>
-      <w:r>
-        <w:rPr>
-          <w:rFonts w:ascii="바탕" w:hAnsi="바탕" w:eastAsia="바탕"/>
-          <w:b w:val="0"/>
-          <w:sz w:val="22"/>
-        </w:rPr>
-        <w:t xml:space="preserve">2. </w:t>
-      </w:r>
-      <w:r>
-        <w:rPr>
-          <w:rFonts w:ascii="바탕" w:hAnsi="바탕" w:eastAsia="바탕"/>
-          <w:b/>
-          <w:sz w:val="22"/>
-        </w:rPr>
-        <w:t>공간 정합 개선</w:t>
-      </w:r>
-      <w:r>
-        <w:rPr>
-          <w:rFonts w:ascii="바탕" w:hAnsi="바탕" w:eastAsia="바탕"/>
-          <w:b w:val="0"/>
-          <w:sz w:val="22"/>
-        </w:rPr>
-        <w:t xml:space="preserve">: 시설 변수를 </w:t>
-      </w:r>
-      <w:r>
-        <w:rPr>
-          <w:rFonts w:ascii="바탕" w:hAnsi="바탕" w:eastAsia="바탕"/>
-          <w:b/>
-          <w:sz w:val="22"/>
-        </w:rPr>
-        <w:t>행정동 경계 내 개수</w:t>
-      </w:r>
-      <w:r>
-        <w:rPr>
-          <w:rFonts w:ascii="바탕" w:hAnsi="바탕" w:eastAsia="바탕"/>
-          <w:b w:val="0"/>
-          <w:sz w:val="22"/>
-        </w:rPr>
-        <w:t xml:space="preserve">에서 </w:t>
-      </w:r>
-      <w:r>
-        <w:rPr>
-          <w:rFonts w:ascii="바탕" w:hAnsi="바탕" w:eastAsia="바탕"/>
-          <w:b/>
-          <w:sz w:val="22"/>
-        </w:rPr>
-        <w:t>거래 아파트 단지 좌표 기준 거리·반경 접근성</w:t>
-      </w:r>
-      <w:r>
-        <w:rPr>
-          <w:rFonts w:ascii="바탕" w:hAnsi="바탕" w:eastAsia="바탕"/>
-          <w:b w:val="0"/>
-          <w:sz w:val="22"/>
-        </w:rPr>
-        <w:t xml:space="preserve"> 지표로 재구성하여 MAUP 문제를 완화한다. 13개 시설군(지하철·학교·학원·어린이집·공원·도서관·대형마트·백화점·CCTV·병원 등)에 대해 반경 500m/1km/2km 개수와 최근접거리를 병행 산출한다.</w:t>
-      </w:r>
-    </w:p>
-    <w:p>
-      <w:r>
-        <w:rPr>
-          <w:rFonts w:ascii="바탕" w:hAnsi="바탕" w:eastAsia="바탕"/>
-          <w:b w:val="0"/>
-          <w:sz w:val="22"/>
-        </w:rPr>
-        <w:t xml:space="preserve">3. </w:t>
-      </w:r>
-      <w:r>
-        <w:rPr>
-          <w:rFonts w:ascii="바탕" w:hAnsi="바탕" w:eastAsia="바탕"/>
-          <w:b/>
-          <w:sz w:val="22"/>
-        </w:rPr>
-        <w:t>시간 정합 개선</w:t>
-      </w:r>
-      <w:r>
-        <w:rPr>
-          <w:rFonts w:ascii="바탕" w:hAnsi="바탕" w:eastAsia="바탕"/>
-          <w:b w:val="0"/>
-          <w:sz w:val="22"/>
-        </w:rPr>
-        <w:t xml:space="preserve">: 시설의 개업·폐업·신설 이력을 반영하여 </w:t>
-      </w:r>
-      <w:r>
-        <w:rPr>
-          <w:rFonts w:ascii="바탕" w:hAnsi="바탕" w:eastAsia="바탕"/>
-          <w:b/>
-          <w:sz w:val="22"/>
-        </w:rPr>
-        <w:t>연도별(2019~2025) 활동 시설만 필터링</w:t>
-      </w:r>
-      <w:r>
-        <w:rPr>
-          <w:rFonts w:ascii="바탕" w:hAnsi="바탕" w:eastAsia="바탕"/>
-          <w:b w:val="0"/>
-          <w:sz w:val="22"/>
-        </w:rPr>
-        <w:t>한 연도 정합 스냅샷을 구축한다.</w:t>
-      </w:r>
-    </w:p>
-    <w:p>
-      <w:r>
-        <w:rPr>
-          <w:rFonts w:ascii="바탕" w:hAnsi="바탕" w:eastAsia="바탕"/>
-          <w:b w:val="0"/>
-          <w:sz w:val="22"/>
-        </w:rPr>
-        <w:t xml:space="preserve">4. </w:t>
-      </w:r>
-      <w:r>
-        <w:rPr>
-          <w:rFonts w:ascii="바탕" w:hAnsi="바탕" w:eastAsia="바탕"/>
-          <w:b/>
-          <w:sz w:val="22"/>
-        </w:rPr>
-        <w:t>시공간 이질성 실증</w:t>
-      </w:r>
-      <w:r>
-        <w:rPr>
-          <w:rFonts w:ascii="바탕" w:hAnsi="바탕" w:eastAsia="바탕"/>
-          <w:b w:val="0"/>
-          <w:sz w:val="22"/>
-        </w:rPr>
-        <w:t>: SHAP을 전체·권역(강남3구/비강남)·연도·면적대·</w:t>
-      </w:r>
-      <w:r>
-        <w:rPr>
-          <w:rFonts w:ascii="바탕" w:hAnsi="바탕" w:eastAsia="바탕"/>
-          <w:b/>
-          <w:sz w:val="22"/>
-        </w:rPr>
-        <w:t>연도×권역</w:t>
-      </w:r>
-      <w:r>
-        <w:rPr>
-          <w:rFonts w:ascii="바탕" w:hAnsi="바탕" w:eastAsia="바탕"/>
-          <w:b w:val="0"/>
-          <w:sz w:val="22"/>
-        </w:rPr>
-        <w:t xml:space="preserve"> 분할에서 산출하여 설명 신호의 이질성과 국면별 변화 양상을 포착한다.</w:t>
       </w:r>
     </w:p>
     <w:p>
       <w:pPr>
+        <w:pStyle w:val="ListNumber"/>
+        <w:ind w:firstLine="0"/>
+      </w:pPr>
+      <w:r>
+        <w:rPr>
+          <w:rFonts w:ascii="바탕" w:hAnsi="바탕" w:eastAsia="바탕"/>
+          <w:b/>
+          <w:sz w:val="22"/>
+        </w:rPr>
+        <w:t>공간 정합 개선</w:t>
+      </w:r>
+      <w:r>
+        <w:rPr>
+          <w:rFonts w:ascii="바탕" w:hAnsi="바탕" w:eastAsia="바탕"/>
+          <w:b w:val="0"/>
+          <w:sz w:val="22"/>
+        </w:rPr>
+        <w:t xml:space="preserve">: 시설 변수를 </w:t>
+      </w:r>
+      <w:r>
+        <w:rPr>
+          <w:rFonts w:ascii="바탕" w:hAnsi="바탕" w:eastAsia="바탕"/>
+          <w:b/>
+          <w:sz w:val="22"/>
+        </w:rPr>
+        <w:t>행정동 경계 내 개수</w:t>
+      </w:r>
+      <w:r>
+        <w:rPr>
+          <w:rFonts w:ascii="바탕" w:hAnsi="바탕" w:eastAsia="바탕"/>
+          <w:b w:val="0"/>
+          <w:sz w:val="22"/>
+        </w:rPr>
+        <w:t xml:space="preserve">에서 </w:t>
+      </w:r>
+      <w:r>
+        <w:rPr>
+          <w:rFonts w:ascii="바탕" w:hAnsi="바탕" w:eastAsia="바탕"/>
+          <w:b/>
+          <w:sz w:val="22"/>
+        </w:rPr>
+        <w:t>거래 아파트 단지 좌표 기준 거리·반경 접근성</w:t>
+      </w:r>
+      <w:r>
+        <w:rPr>
+          <w:rFonts w:ascii="바탕" w:hAnsi="바탕" w:eastAsia="바탕"/>
+          <w:b w:val="0"/>
+          <w:sz w:val="22"/>
+        </w:rPr>
+        <w:t xml:space="preserve"> 지표로 재구성하여 MAUP 문제를 완화한다. 13개 시설군(지하철·학교·학원·어린이집·공원·도서관·대형마트·백화점·CCTV·병원 등)에 대해 반경 500m/1km/2km 개수와 최근접거리를 병행 산출한다.</w:t>
+      </w:r>
+    </w:p>
+    <w:p>
+      <w:pPr>
+        <w:pStyle w:val="ListNumber"/>
+        <w:ind w:firstLine="0"/>
+      </w:pPr>
+      <w:r>
+        <w:rPr>
+          <w:rFonts w:ascii="바탕" w:hAnsi="바탕" w:eastAsia="바탕"/>
+          <w:b/>
+          <w:sz w:val="22"/>
+        </w:rPr>
+        <w:t>시간 정합 개선</w:t>
+      </w:r>
+      <w:r>
+        <w:rPr>
+          <w:rFonts w:ascii="바탕" w:hAnsi="바탕" w:eastAsia="바탕"/>
+          <w:b w:val="0"/>
+          <w:sz w:val="22"/>
+        </w:rPr>
+        <w:t xml:space="preserve">: 시설의 개업·폐업·신설 이력을 반영하여 </w:t>
+      </w:r>
+      <w:r>
+        <w:rPr>
+          <w:rFonts w:ascii="바탕" w:hAnsi="바탕" w:eastAsia="바탕"/>
+          <w:b/>
+          <w:sz w:val="22"/>
+        </w:rPr>
+        <w:t>연도별(2019~2025) 활동 시설만 필터링</w:t>
+      </w:r>
+      <w:r>
+        <w:rPr>
+          <w:rFonts w:ascii="바탕" w:hAnsi="바탕" w:eastAsia="바탕"/>
+          <w:b w:val="0"/>
+          <w:sz w:val="22"/>
+        </w:rPr>
+        <w:t>한 연도 정합 스냅샷을 구축한다.</w:t>
+      </w:r>
+    </w:p>
+    <w:p>
+      <w:pPr>
+        <w:pStyle w:val="ListNumber"/>
+        <w:ind w:firstLine="0"/>
+      </w:pPr>
+      <w:r>
+        <w:rPr>
+          <w:rFonts w:ascii="바탕" w:hAnsi="바탕" w:eastAsia="바탕"/>
+          <w:b/>
+          <w:sz w:val="22"/>
+        </w:rPr>
+        <w:t>시공간 이질성 실증</w:t>
+      </w:r>
+      <w:r>
+        <w:rPr>
+          <w:rFonts w:ascii="바탕" w:hAnsi="바탕" w:eastAsia="바탕"/>
+          <w:b w:val="0"/>
+          <w:sz w:val="22"/>
+        </w:rPr>
+        <w:t>: SHAP을 전체·권역(강남3구/비강남)·연도·면적대·</w:t>
+      </w:r>
+      <w:r>
+        <w:rPr>
+          <w:rFonts w:ascii="바탕" w:hAnsi="바탕" w:eastAsia="바탕"/>
+          <w:b/>
+          <w:sz w:val="22"/>
+        </w:rPr>
+        <w:t>연도×권역</w:t>
+      </w:r>
+      <w:r>
+        <w:rPr>
+          <w:rFonts w:ascii="바탕" w:hAnsi="바탕" w:eastAsia="바탕"/>
+          <w:b w:val="0"/>
+          <w:sz w:val="22"/>
+        </w:rPr>
+        <w:t xml:space="preserve"> 분할에서 산출하여 설명 신호의 이질성과 국면별 변화 양상을 포착한다.</w:t>
+      </w:r>
+    </w:p>
+    <w:p>
+      <w:pPr>
+        <w:pStyle w:val="Heading3"/>
         <w:spacing w:before="240" w:after="160"/>
         <w:ind w:firstLine="0"/>
         <w:jc w:val="left"/>
@@ -1598,6 +1699,7 @@
     </w:p>
     <w:p>
       <w:pPr>
+        <w:pStyle w:val="Heading3"/>
         <w:spacing w:before="240" w:after="160"/>
         <w:ind w:firstLine="0"/>
         <w:jc w:val="left"/>
@@ -1687,6 +1789,7 @@
     </w:p>
     <w:p>
       <w:pPr>
+        <w:pStyle w:val="Heading2"/>
         <w:spacing w:before="360" w:after="240"/>
         <w:ind w:firstLine="0"/>
         <w:jc w:val="left"/>
@@ -1702,6 +1805,7 @@
     </w:p>
     <w:p>
       <w:pPr>
+        <w:pStyle w:val="Heading3"/>
         <w:spacing w:before="240" w:after="160"/>
         <w:ind w:firstLine="0"/>
         <w:jc w:val="left"/>
@@ -1737,6 +1841,7 @@
     </w:p>
     <w:p>
       <w:pPr>
+        <w:pStyle w:val="Heading3"/>
         <w:spacing w:before="240" w:after="160"/>
         <w:ind w:firstLine="0"/>
         <w:jc w:val="left"/>
@@ -1822,6 +1927,7 @@
     </w:p>
     <w:p>
       <w:pPr>
+        <w:pStyle w:val="Heading2"/>
         <w:spacing w:before="360" w:after="240"/>
         <w:ind w:firstLine="0"/>
         <w:jc w:val="left"/>
@@ -1907,6 +2013,7 @@
     </w:p>
     <w:p>
       <w:pPr>
+        <w:pStyle w:val="Heading1"/>
         <w:spacing w:before="480" w:after="360"/>
         <w:ind w:firstLine="0"/>
         <w:jc w:val="center"/>
@@ -1922,6 +2029,7 @@
     </w:p>
     <w:p>
       <w:pPr>
+        <w:pStyle w:val="Heading2"/>
         <w:spacing w:before="360" w:after="240"/>
         <w:ind w:firstLine="0"/>
         <w:jc w:val="left"/>
@@ -1937,6 +2045,7 @@
     </w:p>
     <w:p>
       <w:pPr>
+        <w:pStyle w:val="Heading3"/>
         <w:spacing w:before="240" w:after="160"/>
         <w:ind w:firstLine="0"/>
         <w:jc w:val="left"/>
@@ -2587,6 +2696,7 @@
     </w:p>
     <w:p>
       <w:pPr>
+        <w:pStyle w:val="Heading3"/>
         <w:spacing w:before="240" w:after="160"/>
         <w:ind w:firstLine="0"/>
         <w:jc w:val="left"/>
@@ -2652,6 +2762,7 @@
     </w:p>
     <w:p>
       <w:pPr>
+        <w:pStyle w:val="Heading3"/>
         <w:spacing w:before="240" w:after="160"/>
         <w:ind w:firstLine="0"/>
         <w:jc w:val="left"/>
@@ -2697,6 +2808,7 @@
     </w:p>
     <w:p>
       <w:pPr>
+        <w:pStyle w:val="Heading2"/>
         <w:spacing w:before="360" w:after="240"/>
         <w:ind w:firstLine="0"/>
         <w:jc w:val="left"/>
@@ -2712,6 +2824,7 @@
     </w:p>
     <w:p>
       <w:pPr>
+        <w:pStyle w:val="Heading3"/>
         <w:spacing w:before="240" w:after="160"/>
         <w:ind w:firstLine="0"/>
         <w:jc w:val="left"/>
@@ -2825,6 +2938,7 @@
     </w:p>
     <w:p>
       <w:pPr>
+        <w:pStyle w:val="Heading3"/>
         <w:spacing w:before="240" w:after="160"/>
         <w:ind w:firstLine="0"/>
         <w:jc w:val="left"/>
@@ -3389,6 +3503,7 @@
     </w:p>
     <w:p>
       <w:pPr>
+        <w:pStyle w:val="Heading3"/>
         <w:spacing w:before="240" w:after="160"/>
         <w:ind w:firstLine="0"/>
         <w:jc w:val="left"/>
@@ -3424,6 +3539,7 @@
     </w:p>
     <w:p>
       <w:pPr>
+        <w:pStyle w:val="Heading2"/>
         <w:spacing w:before="360" w:after="240"/>
         <w:ind w:firstLine="0"/>
         <w:jc w:val="left"/>
@@ -3439,6 +3555,7 @@
     </w:p>
     <w:p>
       <w:pPr>
+        <w:pStyle w:val="Heading3"/>
         <w:spacing w:before="240" w:after="160"/>
         <w:ind w:firstLine="0"/>
         <w:jc w:val="left"/>
@@ -3578,6 +3695,7 @@
     </w:p>
     <w:p>
       <w:pPr>
+        <w:pStyle w:val="Heading3"/>
         <w:spacing w:before="240" w:after="160"/>
         <w:ind w:firstLine="0"/>
         <w:jc w:val="left"/>
@@ -3639,6 +3757,7 @@
     </w:p>
     <w:p>
       <w:pPr>
+        <w:pStyle w:val="Heading3"/>
         <w:spacing w:before="240" w:after="160"/>
         <w:ind w:firstLine="0"/>
         <w:jc w:val="left"/>
@@ -4648,111 +4767,96 @@
       </w:r>
     </w:p>
     <w:p>
+      <w:pPr>
+        <w:pStyle w:val="ListBullet"/>
+        <w:ind w:firstLine="0"/>
+      </w:pPr>
+      <w:r>
+        <w:rPr>
+          <w:rFonts w:ascii="바탕" w:hAnsi="바탕" w:eastAsia="바탕"/>
+          <w:b/>
+          <w:sz w:val="22"/>
+        </w:rPr>
+        <w:t>SHAP Summary Plot</w:t>
+      </w:r>
       <w:r>
         <w:rPr>
           <w:rFonts w:ascii="바탕" w:hAnsi="바탕" w:eastAsia="바탕"/>
           <w:b w:val="0"/>
           <w:sz w:val="22"/>
         </w:rPr>
-        <w:t xml:space="preserve">- </w:t>
-      </w:r>
-      <w:r>
-        <w:rPr>
-          <w:rFonts w:ascii="바탕" w:hAnsi="바탕" w:eastAsia="바탕"/>
-          <w:b/>
-          <w:sz w:val="22"/>
-        </w:rPr>
-        <w:t>SHAP Summary Plot</w:t>
-      </w:r>
-      <w:r>
-        <w:rPr>
-          <w:rFonts w:ascii="바탕" w:hAnsi="바탕" w:eastAsia="바탕"/>
-          <w:b w:val="0"/>
-          <w:sz w:val="22"/>
-        </w:rPr>
         <w:t>: 모든 특성의 SHAP값 분포를 동시에 표시하여 글로벌 변수 중요도와 영향 방향을 파악한다.</w:t>
-      </w:r>
-    </w:p>
-    <w:p>
-      <w:r>
-        <w:rPr>
-          <w:rFonts w:ascii="바탕" w:hAnsi="바탕" w:eastAsia="바탕"/>
-          <w:b w:val="0"/>
-          <w:sz w:val="22"/>
-        </w:rPr>
-        <w:t xml:space="preserve">- </w:t>
-      </w:r>
-      <w:r>
-        <w:rPr>
-          <w:rFonts w:ascii="바탕" w:hAnsi="바탕" w:eastAsia="바탕"/>
-          <w:b/>
-          <w:sz w:val="22"/>
-        </w:rPr>
-        <w:t>SHAP Bar Plot</w:t>
-      </w:r>
-      <w:r>
-        <w:rPr>
-          <w:rFonts w:ascii="바탕" w:hAnsi="바탕" w:eastAsia="바탕"/>
-          <w:b w:val="0"/>
-          <w:sz w:val="22"/>
-        </w:rPr>
-        <w:t>: 평균 절대 SHAP값(mean |SHAP value|) 기준으로 변수 중요도를 순위화한다.</w:t>
-      </w:r>
-    </w:p>
-    <w:p>
-      <w:r>
-        <w:rPr>
-          <w:rFonts w:ascii="바탕" w:hAnsi="바탕" w:eastAsia="바탕"/>
-          <w:b w:val="0"/>
-          <w:sz w:val="22"/>
-        </w:rPr>
-        <w:t xml:space="preserve">- </w:t>
-      </w:r>
-      <w:r>
-        <w:rPr>
-          <w:rFonts w:ascii="바탕" w:hAnsi="바탕" w:eastAsia="바탕"/>
-          <w:b/>
-          <w:sz w:val="22"/>
-        </w:rPr>
-        <w:t>SHAP Dependence Plot</w:t>
-      </w:r>
-      <w:r>
-        <w:rPr>
-          <w:rFonts w:ascii="바탕" w:hAnsi="바탕" w:eastAsia="바탕"/>
-          <w:b w:val="0"/>
-          <w:sz w:val="22"/>
-        </w:rPr>
-        <w:t>: 특정 변수의 값과 SHAP값 간의 관계를 산점도로 표시하여 비선형 효과를 시각화한다.</w:t>
-      </w:r>
-    </w:p>
-    <w:p>
-      <w:r>
-        <w:rPr>
-          <w:rFonts w:ascii="바탕" w:hAnsi="바탕" w:eastAsia="바탕"/>
-          <w:b w:val="0"/>
-          <w:sz w:val="22"/>
-        </w:rPr>
-        <w:t xml:space="preserve">- </w:t>
-      </w:r>
-      <w:r>
-        <w:rPr>
-          <w:rFonts w:ascii="바탕" w:hAnsi="바탕" w:eastAsia="바탕"/>
-          <w:b/>
-          <w:sz w:val="22"/>
-        </w:rPr>
-        <w:t>SHAP Waterfall Plot</w:t>
-      </w:r>
-      <w:r>
-        <w:rPr>
-          <w:rFonts w:ascii="바탕" w:hAnsi="바탕" w:eastAsia="바탕"/>
-          <w:b w:val="0"/>
-          <w:sz w:val="22"/>
-        </w:rPr>
-        <w:t>: 개별 예측에 대해 기본값에서 각 특성의 기여를 순차적으로 누적하여 최종 예측값에 도달하는 과정을 표시한다.</w:t>
       </w:r>
     </w:p>
     <w:p>
       <w:pPr>
+        <w:pStyle w:val="ListBullet"/>
+        <w:ind w:firstLine="0"/>
+      </w:pPr>
+      <w:r>
+        <w:rPr>
+          <w:rFonts w:ascii="바탕" w:hAnsi="바탕" w:eastAsia="바탕"/>
+          <w:b/>
+          <w:sz w:val="22"/>
+        </w:rPr>
+        <w:t>SHAP Bar Plot</w:t>
+      </w:r>
+      <w:r>
+        <w:rPr>
+          <w:rFonts w:ascii="바탕" w:hAnsi="바탕" w:eastAsia="바탕"/>
+          <w:b w:val="0"/>
+          <w:sz w:val="22"/>
+        </w:rPr>
+        <w:t>: 평균 절대 SHAP값(mean |SHAP value|) 기준으로 변수 중요도를 순위화한다.</w:t>
+      </w:r>
+    </w:p>
+    <w:p>
+      <w:pPr>
+        <w:pStyle w:val="ListBullet"/>
+        <w:ind w:firstLine="0"/>
+      </w:pPr>
+      <w:r>
+        <w:rPr>
+          <w:rFonts w:ascii="바탕" w:hAnsi="바탕" w:eastAsia="바탕"/>
+          <w:b/>
+          <w:sz w:val="22"/>
+        </w:rPr>
+        <w:t>SHAP Dependence Plot</w:t>
+      </w:r>
+      <w:r>
+        <w:rPr>
+          <w:rFonts w:ascii="바탕" w:hAnsi="바탕" w:eastAsia="바탕"/>
+          <w:b w:val="0"/>
+          <w:sz w:val="22"/>
+        </w:rPr>
+        <w:t>: 특정 변수의 값과 SHAP값 간의 관계를 산점도로 표시하여 비선형 효과를 시각화한다.</w:t>
+      </w:r>
+    </w:p>
+    <w:p>
+      <w:pPr>
+        <w:pStyle w:val="ListBullet"/>
+        <w:ind w:firstLine="0"/>
+      </w:pPr>
+      <w:r>
+        <w:rPr>
+          <w:rFonts w:ascii="바탕" w:hAnsi="바탕" w:eastAsia="바탕"/>
+          <w:b/>
+          <w:sz w:val="22"/>
+        </w:rPr>
+        <w:t>SHAP Waterfall Plot</w:t>
+      </w:r>
+      <w:r>
+        <w:rPr>
+          <w:rFonts w:ascii="바탕" w:hAnsi="바탕" w:eastAsia="바탕"/>
+          <w:b w:val="0"/>
+          <w:sz w:val="22"/>
+        </w:rPr>
+        <w:t>: 개별 예측에 대해 기본값에서 각 특성의 기여를 순차적으로 누적하여 최종 예측값에 도달하는 과정을 표시한다.</w:t>
+      </w:r>
+    </w:p>
+    <w:p>
+      <w:pPr>
+        <w:pStyle w:val="Heading2"/>
         <w:spacing w:before="360" w:after="240"/>
         <w:ind w:firstLine="0"/>
         <w:jc w:val="left"/>
@@ -4768,6 +4872,7 @@
     </w:p>
     <w:p>
       <w:pPr>
+        <w:pStyle w:val="Heading3"/>
         <w:spacing w:before="240" w:after="160"/>
         <w:ind w:firstLine="0"/>
         <w:jc w:val="left"/>
@@ -4793,6 +4898,7 @@
     </w:p>
     <w:p>
       <w:pPr>
+        <w:pStyle w:val="Heading4"/>
         <w:spacing w:before="200" w:after="120"/>
         <w:ind w:firstLine="0"/>
         <w:jc w:val="left"/>
@@ -4838,6 +4944,7 @@
     </w:p>
     <w:p>
       <w:pPr>
+        <w:pStyle w:val="Heading4"/>
         <w:spacing w:before="200" w:after="120"/>
         <w:ind w:firstLine="0"/>
         <w:jc w:val="left"/>
@@ -4863,6 +4970,7 @@
     </w:p>
     <w:p>
       <w:pPr>
+        <w:pStyle w:val="Heading4"/>
         <w:spacing w:before="200" w:after="120"/>
         <w:ind w:firstLine="0"/>
         <w:jc w:val="left"/>
@@ -4904,6 +5012,7 @@
     </w:p>
     <w:p>
       <w:pPr>
+        <w:pStyle w:val="Heading3"/>
         <w:spacing w:before="240" w:after="160"/>
         <w:ind w:firstLine="0"/>
         <w:jc w:val="left"/>
@@ -4929,6 +5038,7 @@
     </w:p>
     <w:p>
       <w:pPr>
+        <w:pStyle w:val="Heading4"/>
         <w:spacing w:before="200" w:after="120"/>
         <w:ind w:firstLine="0"/>
         <w:jc w:val="left"/>
@@ -4984,6 +5094,7 @@
     </w:p>
     <w:p>
       <w:pPr>
+        <w:pStyle w:val="Heading4"/>
         <w:spacing w:before="200" w:after="120"/>
         <w:ind w:firstLine="0"/>
         <w:jc w:val="left"/>
@@ -5029,6 +5140,7 @@
     </w:p>
     <w:p>
       <w:pPr>
+        <w:pStyle w:val="Heading4"/>
         <w:spacing w:before="200" w:after="120"/>
         <w:ind w:firstLine="0"/>
         <w:jc w:val="left"/>
@@ -5074,6 +5186,7 @@
     </w:p>
     <w:p>
       <w:pPr>
+        <w:pStyle w:val="Heading3"/>
         <w:spacing w:before="240" w:after="160"/>
         <w:ind w:firstLine="0"/>
         <w:jc w:val="left"/>
@@ -5249,6 +5362,7 @@
     </w:p>
     <w:p>
       <w:pPr>
+        <w:pStyle w:val="Heading1"/>
         <w:spacing w:before="480" w:after="360"/>
         <w:ind w:firstLine="0"/>
         <w:jc w:val="center"/>
@@ -5264,6 +5378,7 @@
     </w:p>
     <w:p>
       <w:pPr>
+        <w:pStyle w:val="Heading2"/>
         <w:spacing w:before="360" w:after="240"/>
         <w:ind w:firstLine="0"/>
         <w:jc w:val="left"/>
@@ -5369,6 +5484,7 @@
     </w:p>
     <w:p>
       <w:pPr>
+        <w:pStyle w:val="Heading2"/>
         <w:spacing w:before="360" w:after="240"/>
         <w:ind w:firstLine="0"/>
         <w:jc w:val="left"/>
@@ -5384,6 +5500,7 @@
     </w:p>
     <w:p>
       <w:pPr>
+        <w:pStyle w:val="Heading3"/>
         <w:spacing w:before="240" w:after="160"/>
         <w:ind w:firstLine="0"/>
         <w:jc w:val="left"/>
@@ -5427,6 +5544,7 @@
     </w:p>
     <w:p>
       <w:pPr>
+        <w:pStyle w:val="Heading3"/>
         <w:spacing w:before="240" w:after="160"/>
         <w:ind w:firstLine="0"/>
         <w:jc w:val="left"/>
@@ -5498,6 +5616,7 @@
     </w:p>
     <w:p>
       <w:pPr>
+        <w:pStyle w:val="Heading3"/>
         <w:spacing w:before="240" w:after="160"/>
         <w:ind w:firstLine="0"/>
         <w:jc w:val="left"/>
@@ -5549,6 +5668,7 @@
     </w:p>
     <w:p>
       <w:pPr>
+        <w:pStyle w:val="Heading3"/>
         <w:spacing w:before="240" w:after="160"/>
         <w:ind w:firstLine="0"/>
         <w:jc w:val="left"/>
@@ -8210,6 +8330,7 @@
     </w:p>
     <w:p>
       <w:pPr>
+        <w:pStyle w:val="Heading3"/>
         <w:spacing w:before="240" w:after="160"/>
         <w:ind w:firstLine="0"/>
         <w:jc w:val="left"/>
@@ -8261,6 +8382,7 @@
     </w:p>
     <w:p>
       <w:pPr>
+        <w:pStyle w:val="Heading2"/>
         <w:spacing w:before="360" w:after="240"/>
         <w:ind w:firstLine="0"/>
         <w:jc w:val="left"/>
@@ -8276,6 +8398,7 @@
     </w:p>
     <w:p>
       <w:pPr>
+        <w:pStyle w:val="Heading3"/>
         <w:spacing w:before="240" w:after="160"/>
         <w:ind w:firstLine="0"/>
         <w:jc w:val="left"/>
@@ -8686,6 +8809,7 @@
     </w:p>
     <w:p>
       <w:pPr>
+        <w:pStyle w:val="Heading3"/>
         <w:spacing w:before="240" w:after="160"/>
         <w:ind w:firstLine="0"/>
         <w:jc w:val="left"/>
@@ -8731,6 +8855,7 @@
     </w:p>
     <w:p>
       <w:pPr>
+        <w:pStyle w:val="Heading3"/>
         <w:spacing w:before="240" w:after="160"/>
         <w:ind w:firstLine="0"/>
         <w:jc w:val="left"/>
@@ -8776,6 +8901,7 @@
     </w:p>
     <w:p>
       <w:pPr>
+        <w:pStyle w:val="Heading3"/>
         <w:spacing w:before="240" w:after="160"/>
         <w:ind w:firstLine="0"/>
         <w:jc w:val="left"/>
@@ -8855,6 +8981,7 @@
     </w:p>
     <w:p>
       <w:pPr>
+        <w:pStyle w:val="Heading3"/>
         <w:spacing w:before="240" w:after="160"/>
         <w:ind w:firstLine="0"/>
         <w:jc w:val="left"/>
@@ -9893,6 +10020,7 @@
     </w:p>
     <w:p>
       <w:pPr>
+        <w:pStyle w:val="Heading1"/>
         <w:spacing w:before="480" w:after="360"/>
         <w:ind w:firstLine="0"/>
         <w:jc w:val="center"/>
@@ -9918,6 +10046,7 @@
     </w:p>
     <w:p>
       <w:pPr>
+        <w:pStyle w:val="Heading2"/>
         <w:spacing w:before="360" w:after="240"/>
         <w:ind w:firstLine="0"/>
         <w:jc w:val="left"/>
@@ -9933,6 +10062,7 @@
     </w:p>
     <w:p>
       <w:pPr>
+        <w:pStyle w:val="Heading3"/>
         <w:spacing w:before="240" w:after="160"/>
         <w:ind w:firstLine="0"/>
         <w:jc w:val="left"/>
@@ -9974,6 +10104,7 @@
     </w:p>
     <w:p>
       <w:pPr>
+        <w:pStyle w:val="Heading3"/>
         <w:spacing w:before="240" w:after="160"/>
         <w:ind w:firstLine="0"/>
         <w:jc w:val="left"/>
@@ -11231,6 +11362,7 @@
     </w:p>
     <w:p>
       <w:pPr>
+        <w:pStyle w:val="Heading3"/>
         <w:spacing w:before="240" w:after="160"/>
         <w:ind w:firstLine="0"/>
         <w:jc w:val="left"/>
@@ -12608,6 +12740,7 @@
     </w:p>
     <w:p>
       <w:pPr>
+        <w:pStyle w:val="Heading3"/>
         <w:spacing w:before="240" w:after="160"/>
         <w:ind w:firstLine="0"/>
         <w:jc w:val="left"/>
@@ -13647,6 +13780,7 @@
     </w:p>
     <w:p>
       <w:pPr>
+        <w:pStyle w:val="Heading3"/>
         <w:spacing w:before="240" w:after="160"/>
         <w:ind w:firstLine="0"/>
         <w:jc w:val="left"/>
@@ -13688,6 +13822,7 @@
     </w:p>
     <w:p>
       <w:pPr>
+        <w:pStyle w:val="Heading2"/>
         <w:spacing w:before="360" w:after="240"/>
         <w:ind w:firstLine="0"/>
         <w:jc w:val="left"/>
@@ -13703,6 +13838,7 @@
     </w:p>
     <w:p>
       <w:pPr>
+        <w:pStyle w:val="Heading3"/>
         <w:spacing w:before="240" w:after="160"/>
         <w:ind w:firstLine="0"/>
         <w:jc w:val="left"/>
@@ -15024,6 +15160,7 @@
     </w:p>
     <w:p>
       <w:pPr>
+        <w:pStyle w:val="Heading3"/>
         <w:spacing w:before="240" w:after="160"/>
         <w:ind w:firstLine="0"/>
         <w:jc w:val="left"/>
@@ -15561,6 +15698,7 @@
     </w:p>
     <w:p>
       <w:pPr>
+        <w:pStyle w:val="Heading2"/>
         <w:spacing w:before="360" w:after="240"/>
         <w:ind w:firstLine="0"/>
         <w:jc w:val="left"/>
@@ -15576,6 +15714,7 @@
     </w:p>
     <w:p>
       <w:pPr>
+        <w:pStyle w:val="Heading3"/>
         <w:spacing w:before="240" w:after="160"/>
         <w:ind w:firstLine="0"/>
         <w:jc w:val="left"/>
@@ -15600,143 +15739,128 @@
       </w:r>
     </w:p>
     <w:p>
+      <w:pPr>
+        <w:pStyle w:val="ListBullet"/>
+        <w:ind w:firstLine="0"/>
+      </w:pPr>
+      <w:r>
+        <w:rPr>
+          <w:rFonts w:ascii="바탕" w:hAnsi="바탕" w:eastAsia="바탕"/>
+          <w:b/>
+          <w:sz w:val="22"/>
+        </w:rPr>
+        <w:t>A 행정동 집계만</w:t>
+      </w:r>
       <w:r>
         <w:rPr>
           <w:rFonts w:ascii="바탕" w:hAnsi="바탕" w:eastAsia="바탕"/>
           <w:b w:val="0"/>
           <w:sz w:val="22"/>
         </w:rPr>
-        <w:t xml:space="preserve">- </w:t>
-      </w:r>
-      <w:r>
-        <w:rPr>
-          <w:rFonts w:ascii="바탕" w:hAnsi="바탕" w:eastAsia="바탕"/>
-          <w:b/>
-          <w:sz w:val="22"/>
-        </w:rPr>
-        <w:t>A 행정동 집계만</w:t>
-      </w:r>
-      <w:r>
-        <w:rPr>
-          <w:rFonts w:ascii="바탕" w:hAnsi="바탕" w:eastAsia="바탕"/>
-          <w:b w:val="0"/>
-          <w:sz w:val="22"/>
-        </w:rPr>
         <w:t>: 18개 행정동 집계 변수(물리+강남+행정동 개수+거시)</w:t>
-      </w:r>
-    </w:p>
-    <w:p>
-      <w:r>
-        <w:rPr>
-          <w:rFonts w:ascii="바탕" w:hAnsi="바탕" w:eastAsia="바탕"/>
-          <w:b w:val="0"/>
-          <w:sz w:val="22"/>
-        </w:rPr>
-        <w:t xml:space="preserve">- </w:t>
-      </w:r>
-      <w:r>
-        <w:rPr>
-          <w:rFonts w:ascii="바탕" w:hAnsi="바탕" w:eastAsia="바탕"/>
-          <w:b/>
-          <w:sz w:val="22"/>
-        </w:rPr>
-        <w:t>B 거리만·시점무관</w:t>
-      </w:r>
-      <w:r>
-        <w:rPr>
-          <w:rFonts w:ascii="바탕" w:hAnsi="바탕" w:eastAsia="바탕"/>
-          <w:b w:val="0"/>
-          <w:sz w:val="22"/>
-        </w:rPr>
-        <w:t>: 26개 변수(물리+강남+</w:t>
-      </w:r>
-      <w:r>
-        <w:rPr>
-          <w:rFonts w:ascii="바탕" w:hAnsi="바탕" w:eastAsia="바탕"/>
-          <w:b/>
-          <w:sz w:val="22"/>
-        </w:rPr>
-        <w:t>거리 기반(2026 스냅샷 공통 적용)</w:t>
-      </w:r>
-      <w:r>
-        <w:rPr>
-          <w:rFonts w:ascii="바탕" w:hAnsi="바탕" w:eastAsia="바탕"/>
-          <w:b w:val="0"/>
-          <w:sz w:val="22"/>
-        </w:rPr>
-        <w:t>+거시)</w:t>
-      </w:r>
-    </w:p>
-    <w:p>
-      <w:r>
-        <w:rPr>
-          <w:rFonts w:ascii="바탕" w:hAnsi="바탕" w:eastAsia="바탕"/>
-          <w:b w:val="0"/>
-          <w:sz w:val="22"/>
-        </w:rPr>
-        <w:t xml:space="preserve">- </w:t>
-      </w:r>
-      <w:r>
-        <w:rPr>
-          <w:rFonts w:ascii="바탕" w:hAnsi="바탕" w:eastAsia="바탕"/>
-          <w:b/>
-          <w:sz w:val="22"/>
-        </w:rPr>
-        <w:t>C 거리+시점정합</w:t>
-      </w:r>
-      <w:r>
-        <w:rPr>
-          <w:rFonts w:ascii="바탕" w:hAnsi="바탕" w:eastAsia="바탕"/>
-          <w:b w:val="0"/>
-          <w:sz w:val="22"/>
-        </w:rPr>
-        <w:t xml:space="preserve">: 26개 변수(B와 동일하되 거리 변수를 </w:t>
-      </w:r>
-      <w:r>
-        <w:rPr>
-          <w:rFonts w:ascii="바탕" w:hAnsi="바탕" w:eastAsia="바탕"/>
-          <w:b/>
-          <w:sz w:val="22"/>
-        </w:rPr>
-        <w:t>거래 연도별 스냅샷</w:t>
-      </w:r>
-      <w:r>
-        <w:rPr>
-          <w:rFonts w:ascii="바탕" w:hAnsi="바탕" w:eastAsia="바탕"/>
-          <w:b w:val="0"/>
-          <w:sz w:val="22"/>
-        </w:rPr>
-        <w:t>으로 산출)</w:t>
-      </w:r>
-    </w:p>
-    <w:p>
-      <w:r>
-        <w:rPr>
-          <w:rFonts w:ascii="바탕" w:hAnsi="바탕" w:eastAsia="바탕"/>
-          <w:b w:val="0"/>
-          <w:sz w:val="22"/>
-        </w:rPr>
-        <w:t xml:space="preserve">- </w:t>
-      </w:r>
-      <w:r>
-        <w:rPr>
-          <w:rFonts w:ascii="바탕" w:hAnsi="바탕" w:eastAsia="바탕"/>
-          <w:b/>
-          <w:sz w:val="22"/>
-        </w:rPr>
-        <w:t>D 거리+시점+행정동 통합</w:t>
-      </w:r>
-      <w:r>
-        <w:rPr>
-          <w:rFonts w:ascii="바탕" w:hAnsi="바탕" w:eastAsia="바탕"/>
-          <w:b w:val="0"/>
-          <w:sz w:val="22"/>
-        </w:rPr>
-        <w:t>: 36개 변수(C + legacy 행정동 집계 보조)</w:t>
       </w:r>
     </w:p>
     <w:p>
       <w:pPr>
+        <w:pStyle w:val="ListBullet"/>
+        <w:ind w:firstLine="0"/>
+      </w:pPr>
+      <w:r>
+        <w:rPr>
+          <w:rFonts w:ascii="바탕" w:hAnsi="바탕" w:eastAsia="바탕"/>
+          <w:b/>
+          <w:sz w:val="22"/>
+        </w:rPr>
+        <w:t>B 거리만·시점무관</w:t>
+      </w:r>
+      <w:r>
+        <w:rPr>
+          <w:rFonts w:ascii="바탕" w:hAnsi="바탕" w:eastAsia="바탕"/>
+          <w:b w:val="0"/>
+          <w:sz w:val="22"/>
+        </w:rPr>
+        <w:t>: 26개 변수(물리+강남+</w:t>
+      </w:r>
+      <w:r>
+        <w:rPr>
+          <w:rFonts w:ascii="바탕" w:hAnsi="바탕" w:eastAsia="바탕"/>
+          <w:b/>
+          <w:sz w:val="22"/>
+        </w:rPr>
+        <w:t>거리 기반(2026 스냅샷 공통 적용)</w:t>
+      </w:r>
+      <w:r>
+        <w:rPr>
+          <w:rFonts w:ascii="바탕" w:hAnsi="바탕" w:eastAsia="바탕"/>
+          <w:b w:val="0"/>
+          <w:sz w:val="22"/>
+        </w:rPr>
+        <w:t>+거시)</w:t>
+      </w:r>
+    </w:p>
+    <w:p>
+      <w:pPr>
+        <w:pStyle w:val="ListBullet"/>
+        <w:ind w:firstLine="0"/>
+      </w:pPr>
+      <w:r>
+        <w:rPr>
+          <w:rFonts w:ascii="바탕" w:hAnsi="바탕" w:eastAsia="바탕"/>
+          <w:b/>
+          <w:sz w:val="22"/>
+        </w:rPr>
+        <w:t>C 거리+시점정합</w:t>
+      </w:r>
+      <w:r>
+        <w:rPr>
+          <w:rFonts w:ascii="바탕" w:hAnsi="바탕" w:eastAsia="바탕"/>
+          <w:b w:val="0"/>
+          <w:sz w:val="22"/>
+        </w:rPr>
+        <w:t xml:space="preserve">: 26개 변수(B와 동일하되 거리 변수를 </w:t>
+      </w:r>
+      <w:r>
+        <w:rPr>
+          <w:rFonts w:ascii="바탕" w:hAnsi="바탕" w:eastAsia="바탕"/>
+          <w:b/>
+          <w:sz w:val="22"/>
+        </w:rPr>
+        <w:t>거래 연도별 스냅샷</w:t>
+      </w:r>
+      <w:r>
+        <w:rPr>
+          <w:rFonts w:ascii="바탕" w:hAnsi="바탕" w:eastAsia="바탕"/>
+          <w:b w:val="0"/>
+          <w:sz w:val="22"/>
+        </w:rPr>
+        <w:t>으로 산출)</w:t>
+      </w:r>
+    </w:p>
+    <w:p>
+      <w:pPr>
+        <w:pStyle w:val="ListBullet"/>
+        <w:ind w:firstLine="0"/>
+      </w:pPr>
+      <w:r>
+        <w:rPr>
+          <w:rFonts w:ascii="바탕" w:hAnsi="바탕" w:eastAsia="바탕"/>
+          <w:b/>
+          <w:sz w:val="22"/>
+        </w:rPr>
+        <w:t>D 거리+시점+행정동 통합</w:t>
+      </w:r>
+      <w:r>
+        <w:rPr>
+          <w:rFonts w:ascii="바탕" w:hAnsi="바탕" w:eastAsia="바탕"/>
+          <w:b w:val="0"/>
+          <w:sz w:val="22"/>
+        </w:rPr>
+        <w:t>: 36개 변수(C + legacy 행정동 집계 보조)</w:t>
+      </w:r>
+    </w:p>
+    <w:p>
+      <w:pPr>
+        <w:pStyle w:val="Heading3"/>
         <w:spacing w:before="240" w:after="160"/>
         <w:ind w:firstLine="0"/>
         <w:jc w:val="left"/>
@@ -16377,6 +16501,7 @@
     </w:p>
     <w:p>
       <w:pPr>
+        <w:pStyle w:val="Heading3"/>
         <w:spacing w:before="240" w:after="160"/>
         <w:ind w:firstLine="0"/>
         <w:jc w:val="left"/>
@@ -16520,6 +16645,7 @@
     </w:p>
     <w:p>
       <w:pPr>
+        <w:pStyle w:val="Heading2"/>
         <w:spacing w:before="360" w:after="240"/>
         <w:ind w:firstLine="0"/>
         <w:jc w:val="left"/>
@@ -16535,6 +16661,7 @@
     </w:p>
     <w:p>
       <w:pPr>
+        <w:pStyle w:val="Heading3"/>
         <w:spacing w:before="240" w:after="160"/>
         <w:ind w:firstLine="0"/>
         <w:jc w:val="left"/>
@@ -18416,6 +18543,7 @@
     </w:p>
     <w:p>
       <w:pPr>
+        <w:pStyle w:val="Heading3"/>
         <w:spacing w:before="240" w:after="160"/>
         <w:ind w:firstLine="0"/>
         <w:jc w:val="left"/>
@@ -18430,203 +18558,184 @@
       </w:r>
     </w:p>
     <w:p>
+      <w:pPr>
+        <w:pStyle w:val="ListBullet"/>
+        <w:ind w:firstLine="0"/>
+      </w:pPr>
+      <w:r>
+        <w:rPr>
+          <w:rFonts w:ascii="바탕" w:hAnsi="바탕" w:eastAsia="바탕"/>
+          <w:b/>
+          <w:sz w:val="22"/>
+        </w:rPr>
+        <w:t>권역(강남구분)</w:t>
+      </w:r>
       <w:r>
         <w:rPr>
           <w:rFonts w:ascii="바탕" w:hAnsi="바탕" w:eastAsia="바탕"/>
           <w:b w:val="0"/>
           <w:sz w:val="22"/>
         </w:rPr>
-        <w:t xml:space="preserve">- </w:t>
-      </w:r>
-      <w:r>
-        <w:rPr>
-          <w:rFonts w:ascii="바탕" w:hAnsi="바탕" w:eastAsia="바탕"/>
-          <w:b/>
-          <w:sz w:val="22"/>
-        </w:rPr>
-        <w:t>권역(강남구분)</w:t>
-      </w:r>
-      <w:r>
-        <w:rPr>
-          <w:rFonts w:ascii="바탕" w:hAnsi="바탕" w:eastAsia="바탕"/>
-          <w:b w:val="0"/>
-          <w:sz w:val="22"/>
-        </w:rPr>
         <w:t>: 12.5% — 서울 내 단일 최대 신호</w:t>
-      </w:r>
-    </w:p>
-    <w:p>
-      <w:r>
-        <w:rPr>
-          <w:rFonts w:ascii="바탕" w:hAnsi="바탕" w:eastAsia="바탕"/>
-          <w:b w:val="0"/>
-          <w:sz w:val="22"/>
-        </w:rPr>
-        <w:t xml:space="preserve">- </w:t>
-      </w:r>
-      <w:r>
-        <w:rPr>
-          <w:rFonts w:ascii="바탕" w:hAnsi="바탕" w:eastAsia="바탕"/>
-          <w:b/>
-          <w:sz w:val="22"/>
-        </w:rPr>
-        <w:t>물리 특성(건물연령·전용면적·층)</w:t>
-      </w:r>
-      <w:r>
-        <w:rPr>
-          <w:rFonts w:ascii="바탕" w:hAnsi="바탕" w:eastAsia="바탕"/>
-          <w:b w:val="0"/>
-          <w:sz w:val="22"/>
-        </w:rPr>
-        <w:t>: 21.2%</w:t>
-      </w:r>
-    </w:p>
-    <w:p>
-      <w:r>
-        <w:rPr>
-          <w:rFonts w:ascii="바탕" w:hAnsi="바탕" w:eastAsia="바탕"/>
-          <w:b w:val="0"/>
-          <w:sz w:val="22"/>
-        </w:rPr>
-        <w:t xml:space="preserve">- </w:t>
-      </w:r>
-      <w:r>
-        <w:rPr>
-          <w:rFonts w:ascii="바탕" w:hAnsi="바탕" w:eastAsia="바탕"/>
-          <w:b/>
-          <w:sz w:val="22"/>
-        </w:rPr>
-        <w:t>거시경제(M2·CPI·CD금리)</w:t>
-      </w:r>
-      <w:r>
-        <w:rPr>
-          <w:rFonts w:ascii="바탕" w:hAnsi="바탕" w:eastAsia="바탕"/>
-          <w:b w:val="0"/>
-          <w:sz w:val="22"/>
-        </w:rPr>
-        <w:t>: 16.6%</w:t>
-      </w:r>
-    </w:p>
-    <w:p>
-      <w:r>
-        <w:rPr>
-          <w:rFonts w:ascii="바탕" w:hAnsi="바탕" w:eastAsia="바탕"/>
-          <w:b w:val="0"/>
-          <w:sz w:val="22"/>
-        </w:rPr>
-        <w:t xml:space="preserve">- </w:t>
-      </w:r>
-      <w:r>
-        <w:rPr>
-          <w:rFonts w:ascii="바탕" w:hAnsi="바탕" w:eastAsia="바탕"/>
-          <w:b/>
-          <w:sz w:val="22"/>
-        </w:rPr>
-        <w:t>거리 기반 입지(10개 변수)</w:t>
-      </w:r>
-      <w:r>
-        <w:rPr>
-          <w:rFonts w:ascii="바탕" w:hAnsi="바탕" w:eastAsia="바탕"/>
-          <w:b w:val="0"/>
-          <w:sz w:val="22"/>
-        </w:rPr>
-        <w:t xml:space="preserve">: 약 </w:t>
-      </w:r>
-      <w:r>
-        <w:rPr>
-          <w:rFonts w:ascii="바탕" w:hAnsi="바탕" w:eastAsia="바탕"/>
-          <w:b/>
-          <w:sz w:val="22"/>
-        </w:rPr>
-        <w:t>39%</w:t>
-      </w:r>
-      <w:r>
-        <w:rPr>
-          <w:rFonts w:ascii="바탕" w:hAnsi="바탕" w:eastAsia="바탕"/>
-          <w:b w:val="0"/>
-          <w:sz w:val="22"/>
-        </w:rPr>
-        <w:t xml:space="preserve"> — </w:t>
-      </w:r>
-      <w:r>
-        <w:rPr>
-          <w:rFonts w:ascii="바탕" w:hAnsi="바탕" w:eastAsia="바탕"/>
-          <w:b/>
-          <w:sz w:val="22"/>
-        </w:rPr>
-        <w:t>전체의 최대 단일 그룹</w:t>
-      </w:r>
-    </w:p>
-    <w:p>
-      <w:r>
-        <w:rPr>
-          <w:rFonts w:ascii="바탕" w:hAnsi="바탕" w:eastAsia="바탕"/>
-          <w:b w:val="0"/>
-          <w:sz w:val="22"/>
-        </w:rPr>
-        <w:t xml:space="preserve">- </w:t>
-      </w:r>
-      <w:r>
-        <w:rPr>
-          <w:rFonts w:ascii="바탕" w:hAnsi="바탕" w:eastAsia="바탕"/>
-          <w:b/>
-          <w:sz w:val="22"/>
-        </w:rPr>
-        <w:t>행정동 집계 legacy(표엔 없음)</w:t>
-      </w:r>
-      <w:r>
-        <w:rPr>
-          <w:rFonts w:ascii="바탕" w:hAnsi="바탕" w:eastAsia="바탕"/>
-          <w:b w:val="0"/>
-          <w:sz w:val="22"/>
-        </w:rPr>
-        <w:t>: 잔여 약 10% 내외</w:t>
-      </w:r>
-    </w:p>
-    <w:p>
-      <w:r>
-        <w:rPr>
-          <w:rFonts w:ascii="바탕" w:hAnsi="바탕" w:eastAsia="바탕"/>
-          <w:b w:val="0"/>
-          <w:sz w:val="22"/>
-        </w:rPr>
-        <w:t xml:space="preserve">거리 기반 변수가 전체 설명 기여의 약 40%를 차지하며, 특히 </w:t>
-      </w:r>
-      <w:r>
-        <w:rPr>
-          <w:rFonts w:ascii="바탕" w:hAnsi="바탕" w:eastAsia="바탕"/>
-          <w:b/>
-          <w:sz w:val="22"/>
-        </w:rPr>
-        <w:t>상위 15개 중 8개(53%)가 거리 변수</w:t>
-      </w:r>
-      <w:r>
-        <w:rPr>
-          <w:rFonts w:ascii="바탕" w:hAnsi="바탕" w:eastAsia="바탕"/>
-          <w:b w:val="0"/>
-          <w:sz w:val="22"/>
-        </w:rPr>
-        <w:t xml:space="preserve">라는 점은 행정동 단순 집계 방식에서 놓치고 있던 미시 입지 신호가 거리 기반 설계에서 전면에 드러났음을 의미한다. 이는 교수 심사 피드백에서 지적된 "도서관은 도보 몇 km까지인가, 백화점 조건이 무엇인가"라는 거리 기준 명시 요구에 대해, 본 연구가 </w:t>
-      </w:r>
-      <w:r>
-        <w:rPr>
-          <w:rFonts w:ascii="바탕" w:hAnsi="바탕" w:eastAsia="바탕"/>
-          <w:b/>
-          <w:sz w:val="22"/>
-        </w:rPr>
-        <w:t>반경 500m/1km/2km 다층 지표 + 최근접거리의 이중 설계</w:t>
-      </w:r>
-      <w:r>
-        <w:rPr>
-          <w:rFonts w:ascii="바탕" w:hAnsi="바탕" w:eastAsia="바탕"/>
-          <w:b w:val="0"/>
-          <w:sz w:val="22"/>
-        </w:rPr>
-        <w:t>로 직접 응답한 실증 결과이기도 하다.</w:t>
       </w:r>
     </w:p>
     <w:p>
       <w:pPr>
+        <w:pStyle w:val="ListBullet"/>
+        <w:ind w:firstLine="0"/>
+      </w:pPr>
+      <w:r>
+        <w:rPr>
+          <w:rFonts w:ascii="바탕" w:hAnsi="바탕" w:eastAsia="바탕"/>
+          <w:b/>
+          <w:sz w:val="22"/>
+        </w:rPr>
+        <w:t>물리 특성(건물연령·전용면적·층)</w:t>
+      </w:r>
+      <w:r>
+        <w:rPr>
+          <w:rFonts w:ascii="바탕" w:hAnsi="바탕" w:eastAsia="바탕"/>
+          <w:b w:val="0"/>
+          <w:sz w:val="22"/>
+        </w:rPr>
+        <w:t>: 21.2%</w:t>
+      </w:r>
+    </w:p>
+    <w:p>
+      <w:pPr>
+        <w:pStyle w:val="ListBullet"/>
+        <w:ind w:firstLine="0"/>
+      </w:pPr>
+      <w:r>
+        <w:rPr>
+          <w:rFonts w:ascii="바탕" w:hAnsi="바탕" w:eastAsia="바탕"/>
+          <w:b/>
+          <w:sz w:val="22"/>
+        </w:rPr>
+        <w:t>거시경제(M2·CPI·CD금리)</w:t>
+      </w:r>
+      <w:r>
+        <w:rPr>
+          <w:rFonts w:ascii="바탕" w:hAnsi="바탕" w:eastAsia="바탕"/>
+          <w:b w:val="0"/>
+          <w:sz w:val="22"/>
+        </w:rPr>
+        <w:t>: 16.6%</w:t>
+      </w:r>
+    </w:p>
+    <w:p>
+      <w:pPr>
+        <w:pStyle w:val="ListBullet"/>
+        <w:ind w:firstLine="0"/>
+      </w:pPr>
+      <w:r>
+        <w:rPr>
+          <w:rFonts w:ascii="바탕" w:hAnsi="바탕" w:eastAsia="바탕"/>
+          <w:b/>
+          <w:sz w:val="22"/>
+        </w:rPr>
+        <w:t>거리 기반 입지(10개 변수)</w:t>
+      </w:r>
+      <w:r>
+        <w:rPr>
+          <w:rFonts w:ascii="바탕" w:hAnsi="바탕" w:eastAsia="바탕"/>
+          <w:b w:val="0"/>
+          <w:sz w:val="22"/>
+        </w:rPr>
+        <w:t xml:space="preserve">: 약 </w:t>
+      </w:r>
+      <w:r>
+        <w:rPr>
+          <w:rFonts w:ascii="바탕" w:hAnsi="바탕" w:eastAsia="바탕"/>
+          <w:b/>
+          <w:sz w:val="22"/>
+        </w:rPr>
+        <w:t>39%</w:t>
+      </w:r>
+      <w:r>
+        <w:rPr>
+          <w:rFonts w:ascii="바탕" w:hAnsi="바탕" w:eastAsia="바탕"/>
+          <w:b w:val="0"/>
+          <w:sz w:val="22"/>
+        </w:rPr>
+        <w:t xml:space="preserve"> — </w:t>
+      </w:r>
+      <w:r>
+        <w:rPr>
+          <w:rFonts w:ascii="바탕" w:hAnsi="바탕" w:eastAsia="바탕"/>
+          <w:b/>
+          <w:sz w:val="22"/>
+        </w:rPr>
+        <w:t>전체의 최대 단일 그룹</w:t>
+      </w:r>
+    </w:p>
+    <w:p>
+      <w:pPr>
+        <w:pStyle w:val="ListBullet"/>
+        <w:ind w:firstLine="0"/>
+      </w:pPr>
+      <w:r>
+        <w:rPr>
+          <w:rFonts w:ascii="바탕" w:hAnsi="바탕" w:eastAsia="바탕"/>
+          <w:b/>
+          <w:sz w:val="22"/>
+        </w:rPr>
+        <w:t>행정동 집계 legacy(표엔 없음)</w:t>
+      </w:r>
+      <w:r>
+        <w:rPr>
+          <w:rFonts w:ascii="바탕" w:hAnsi="바탕" w:eastAsia="바탕"/>
+          <w:b w:val="0"/>
+          <w:sz w:val="22"/>
+        </w:rPr>
+        <w:t>: 잔여 약 10% 내외</w:t>
+      </w:r>
+    </w:p>
+    <w:p>
+      <w:r>
+        <w:rPr>
+          <w:rFonts w:ascii="바탕" w:hAnsi="바탕" w:eastAsia="바탕"/>
+          <w:b w:val="0"/>
+          <w:sz w:val="22"/>
+        </w:rPr>
+        <w:t xml:space="preserve">거리 기반 변수가 전체 설명 기여의 약 40%를 차지하며, 특히 </w:t>
+      </w:r>
+      <w:r>
+        <w:rPr>
+          <w:rFonts w:ascii="바탕" w:hAnsi="바탕" w:eastAsia="바탕"/>
+          <w:b/>
+          <w:sz w:val="22"/>
+        </w:rPr>
+        <w:t>상위 15개 중 8개(53%)가 거리 변수</w:t>
+      </w:r>
+      <w:r>
+        <w:rPr>
+          <w:rFonts w:ascii="바탕" w:hAnsi="바탕" w:eastAsia="바탕"/>
+          <w:b w:val="0"/>
+          <w:sz w:val="22"/>
+        </w:rPr>
+        <w:t xml:space="preserve">라는 점은 행정동 단순 집계 방식에서 놓치고 있던 미시 입지 신호가 거리 기반 설계에서 전면에 드러났음을 의미한다. 이는 교수 심사 피드백에서 지적된 "도서관은 도보 몇 km까지인가, 백화점 조건이 무엇인가"라는 거리 기준 명시 요구에 대해, 본 연구가 </w:t>
+      </w:r>
+      <w:r>
+        <w:rPr>
+          <w:rFonts w:ascii="바탕" w:hAnsi="바탕" w:eastAsia="바탕"/>
+          <w:b/>
+          <w:sz w:val="22"/>
+        </w:rPr>
+        <w:t>반경 500m/1km/2km 다층 지표 + 최근접거리의 이중 설계</w:t>
+      </w:r>
+      <w:r>
+        <w:rPr>
+          <w:rFonts w:ascii="바탕" w:hAnsi="바탕" w:eastAsia="바탕"/>
+          <w:b w:val="0"/>
+          <w:sz w:val="22"/>
+        </w:rPr>
+        <w:t>로 직접 응답한 실증 결과이기도 하다.</w:t>
+      </w:r>
+    </w:p>
+    <w:p>
+      <w:pPr>
+        <w:pStyle w:val="Heading3"/>
         <w:spacing w:before="240" w:after="160"/>
         <w:ind w:firstLine="0"/>
         <w:jc w:val="left"/>
@@ -18867,13 +18976,25 @@
       </w:r>
     </w:p>
     <w:p>
+      <w:pPr>
+        <w:pStyle w:val="ListBullet"/>
+        <w:ind w:firstLine="0"/>
+      </w:pPr>
+      <w:r>
+        <w:rPr>
+          <w:rFonts w:ascii="바탕" w:hAnsi="바탕" w:eastAsia="바탕"/>
+          <w:b/>
+          <w:sz w:val="22"/>
+        </w:rPr>
+        <w:t>건물연령</w:t>
+      </w:r>
       <w:r>
         <w:rPr>
           <w:rFonts w:ascii="바탕" w:hAnsi="바탕" w:eastAsia="바탕"/>
           <w:b w:val="0"/>
           <w:sz w:val="22"/>
         </w:rPr>
-        <w:t xml:space="preserve">- </w:t>
+        <w:t xml:space="preserve">: 연식이 증가함에 따라 단위가격 기여가 점진 감소하다가 25~30년 구간에서 반등하는 </w:t>
       </w:r>
       <w:r>
         <w:rPr>
@@ -18881,7 +19002,7 @@
           <w:b/>
           <w:sz w:val="22"/>
         </w:rPr>
-        <w:t>건물연령</w:t>
+        <w:t>U자형</w:t>
       </w:r>
       <w:r>
         <w:rPr>
@@ -18889,173 +19010,142 @@
           <w:b w:val="0"/>
           <w:sz w:val="22"/>
         </w:rPr>
-        <w:t xml:space="preserve">: 연식이 증가함에 따라 단위가격 기여가 점진 감소하다가 25~30년 구간에서 반등하는 </w:t>
-      </w:r>
-      <w:r>
-        <w:rPr>
-          <w:rFonts w:ascii="바탕" w:hAnsi="바탕" w:eastAsia="바탕"/>
-          <w:b/>
-          <w:sz w:val="22"/>
-        </w:rPr>
-        <w:t>U자형</w:t>
-      </w:r>
-      <w:r>
-        <w:rPr>
-          <w:rFonts w:ascii="바탕" w:hAnsi="바탕" w:eastAsia="바탕"/>
-          <w:b w:val="0"/>
-          <w:sz w:val="22"/>
-        </w:rPr>
         <w:t xml:space="preserve"> — 재건축 기대 신호와 일치.</w:t>
-      </w:r>
-    </w:p>
-    <w:p>
-      <w:r>
-        <w:rPr>
-          <w:rFonts w:ascii="바탕" w:hAnsi="바탕" w:eastAsia="바탕"/>
-          <w:b w:val="0"/>
-          <w:sz w:val="22"/>
-        </w:rPr>
-        <w:t xml:space="preserve">- </w:t>
-      </w:r>
-      <w:r>
-        <w:rPr>
-          <w:rFonts w:ascii="바탕" w:hAnsi="바탕" w:eastAsia="바탕"/>
-          <w:b/>
-          <w:sz w:val="22"/>
-        </w:rPr>
-        <w:t>전용면적</w:t>
-      </w:r>
-      <w:r>
-        <w:rPr>
-          <w:rFonts w:ascii="바탕" w:hAnsi="바탕" w:eastAsia="바탕"/>
-          <w:b w:val="0"/>
-          <w:sz w:val="22"/>
-        </w:rPr>
-        <w:t xml:space="preserve">: 소형 구간(60㎡ 미만)에서 +, 대형 구간(112㎡ 이상)에서 − 방향으로 전환되는 </w:t>
-      </w:r>
-      <w:r>
-        <w:rPr>
-          <w:rFonts w:ascii="바탕" w:hAnsi="바탕" w:eastAsia="바탕"/>
-          <w:b/>
-          <w:sz w:val="22"/>
-        </w:rPr>
-        <w:t>체감형</w:t>
-      </w:r>
-      <w:r>
-        <w:rPr>
-          <w:rFonts w:ascii="바탕" w:hAnsi="바탕" w:eastAsia="바탕"/>
-          <w:b w:val="0"/>
-          <w:sz w:val="22"/>
-        </w:rPr>
-        <w:t xml:space="preserve"> — 소형 프리미엄 및 대형 할인을 동시에 포착.</w:t>
-      </w:r>
-    </w:p>
-    <w:p>
-      <w:r>
-        <w:rPr>
-          <w:rFonts w:ascii="바탕" w:hAnsi="바탕" w:eastAsia="바탕"/>
-          <w:b w:val="0"/>
-          <w:sz w:val="22"/>
-        </w:rPr>
-        <w:t xml:space="preserve">- </w:t>
-      </w:r>
-      <w:r>
-        <w:rPr>
-          <w:rFonts w:ascii="바탕" w:hAnsi="바탕" w:eastAsia="바탕"/>
-          <w:b/>
-          <w:sz w:val="22"/>
-        </w:rPr>
-        <w:t>지하철 최근접거리</w:t>
-      </w:r>
-      <w:r>
-        <w:rPr>
-          <w:rFonts w:ascii="바탕" w:hAnsi="바탕" w:eastAsia="바탕"/>
-          <w:b w:val="0"/>
-          <w:sz w:val="22"/>
-        </w:rPr>
-        <w:t xml:space="preserve">: 300m 이내에서 급격한 양의 기여, 500m 이후 평탄화되는 </w:t>
-      </w:r>
-      <w:r>
-        <w:rPr>
-          <w:rFonts w:ascii="바탕" w:hAnsi="바탕" w:eastAsia="바탕"/>
-          <w:b/>
-          <w:sz w:val="22"/>
-        </w:rPr>
-        <w:t>임계 반응형</w:t>
-      </w:r>
-      <w:r>
-        <w:rPr>
-          <w:rFonts w:ascii="바탕" w:hAnsi="바탕" w:eastAsia="바탕"/>
-          <w:b w:val="0"/>
-          <w:sz w:val="22"/>
-        </w:rPr>
-        <w:t xml:space="preserve"> — 도보 역세권 프리미엄.</w:t>
-      </w:r>
-    </w:p>
-    <w:p>
-      <w:r>
-        <w:rPr>
-          <w:rFonts w:ascii="바탕" w:hAnsi="바탕" w:eastAsia="바탕"/>
-          <w:b w:val="0"/>
-          <w:sz w:val="22"/>
-        </w:rPr>
-        <w:t xml:space="preserve">- </w:t>
-      </w:r>
-      <w:r>
-        <w:rPr>
-          <w:rFonts w:ascii="바탕" w:hAnsi="바탕" w:eastAsia="바탕"/>
-          <w:b/>
-          <w:sz w:val="22"/>
-        </w:rPr>
-        <w:t>백화점 최근접거리</w:t>
-      </w:r>
-      <w:r>
-        <w:rPr>
-          <w:rFonts w:ascii="바탕" w:hAnsi="바탕" w:eastAsia="바탕"/>
-          <w:b w:val="0"/>
-          <w:sz w:val="22"/>
-        </w:rPr>
-        <w:t>: 1km 이내에서 강한 양의 기여, 3km 이후 기여 소멸 — 차량 10분권 프리미엄.</w:t>
-      </w:r>
-    </w:p>
-    <w:p>
-      <w:r>
-        <w:rPr>
-          <w:rFonts w:ascii="바탕" w:hAnsi="바탕" w:eastAsia="바탕"/>
-          <w:b w:val="0"/>
-          <w:sz w:val="22"/>
-        </w:rPr>
-        <w:t xml:space="preserve">- </w:t>
-      </w:r>
-      <w:r>
-        <w:rPr>
-          <w:rFonts w:ascii="바탕" w:hAnsi="바탕" w:eastAsia="바탕"/>
-          <w:b/>
-          <w:sz w:val="22"/>
-        </w:rPr>
-        <w:t>어린이집 1km 내 개수</w:t>
-      </w:r>
-      <w:r>
-        <w:rPr>
-          <w:rFonts w:ascii="바탕" w:hAnsi="바탕" w:eastAsia="바탕"/>
-          <w:b w:val="0"/>
-          <w:sz w:val="22"/>
-        </w:rPr>
-        <w:t>: 밀도 40 이상에서 기여 포화 — 생활권 성숙도 프록시.</w:t>
-      </w:r>
-    </w:p>
-    <w:p>
-      <w:r>
-        <w:rPr>
-          <w:rFonts w:ascii="바탕" w:hAnsi="바탕" w:eastAsia="바탕"/>
-          <w:b w:val="0"/>
-          <w:sz w:val="22"/>
-        </w:rPr>
-        <w:t>OLS가 선형 가정으로 이들 패턴을 평균 기울기로만 요약하는 데 비해, XGBoost는 각 구간의 비선형 반응을 데이터에서 직접 학습하고, SHAP은 이를 단위가 통일된 기여 신호로 분해해 해석 가능하게 만든다.</w:t>
       </w:r>
     </w:p>
     <w:p>
       <w:pPr>
+        <w:pStyle w:val="ListBullet"/>
+        <w:ind w:firstLine="0"/>
+      </w:pPr>
+      <w:r>
+        <w:rPr>
+          <w:rFonts w:ascii="바탕" w:hAnsi="바탕" w:eastAsia="바탕"/>
+          <w:b/>
+          <w:sz w:val="22"/>
+        </w:rPr>
+        <w:t>전용면적</w:t>
+      </w:r>
+      <w:r>
+        <w:rPr>
+          <w:rFonts w:ascii="바탕" w:hAnsi="바탕" w:eastAsia="바탕"/>
+          <w:b w:val="0"/>
+          <w:sz w:val="22"/>
+        </w:rPr>
+        <w:t xml:space="preserve">: 소형 구간(60㎡ 미만)에서 +, 대형 구간(112㎡ 이상)에서 − 방향으로 전환되는 </w:t>
+      </w:r>
+      <w:r>
+        <w:rPr>
+          <w:rFonts w:ascii="바탕" w:hAnsi="바탕" w:eastAsia="바탕"/>
+          <w:b/>
+          <w:sz w:val="22"/>
+        </w:rPr>
+        <w:t>체감형</w:t>
+      </w:r>
+      <w:r>
+        <w:rPr>
+          <w:rFonts w:ascii="바탕" w:hAnsi="바탕" w:eastAsia="바탕"/>
+          <w:b w:val="0"/>
+          <w:sz w:val="22"/>
+        </w:rPr>
+        <w:t xml:space="preserve"> — 소형 프리미엄 및 대형 할인을 동시에 포착.</w:t>
+      </w:r>
+    </w:p>
+    <w:p>
+      <w:pPr>
+        <w:pStyle w:val="ListBullet"/>
+        <w:ind w:firstLine="0"/>
+      </w:pPr>
+      <w:r>
+        <w:rPr>
+          <w:rFonts w:ascii="바탕" w:hAnsi="바탕" w:eastAsia="바탕"/>
+          <w:b/>
+          <w:sz w:val="22"/>
+        </w:rPr>
+        <w:t>지하철 최근접거리</w:t>
+      </w:r>
+      <w:r>
+        <w:rPr>
+          <w:rFonts w:ascii="바탕" w:hAnsi="바탕" w:eastAsia="바탕"/>
+          <w:b w:val="0"/>
+          <w:sz w:val="22"/>
+        </w:rPr>
+        <w:t xml:space="preserve">: 300m 이내에서 급격한 양의 기여, 500m 이후 평탄화되는 </w:t>
+      </w:r>
+      <w:r>
+        <w:rPr>
+          <w:rFonts w:ascii="바탕" w:hAnsi="바탕" w:eastAsia="바탕"/>
+          <w:b/>
+          <w:sz w:val="22"/>
+        </w:rPr>
+        <w:t>임계 반응형</w:t>
+      </w:r>
+      <w:r>
+        <w:rPr>
+          <w:rFonts w:ascii="바탕" w:hAnsi="바탕" w:eastAsia="바탕"/>
+          <w:b w:val="0"/>
+          <w:sz w:val="22"/>
+        </w:rPr>
+        <w:t xml:space="preserve"> — 도보 역세권 프리미엄.</w:t>
+      </w:r>
+    </w:p>
+    <w:p>
+      <w:pPr>
+        <w:pStyle w:val="ListBullet"/>
+        <w:ind w:firstLine="0"/>
+      </w:pPr>
+      <w:r>
+        <w:rPr>
+          <w:rFonts w:ascii="바탕" w:hAnsi="바탕" w:eastAsia="바탕"/>
+          <w:b/>
+          <w:sz w:val="22"/>
+        </w:rPr>
+        <w:t>백화점 최근접거리</w:t>
+      </w:r>
+      <w:r>
+        <w:rPr>
+          <w:rFonts w:ascii="바탕" w:hAnsi="바탕" w:eastAsia="바탕"/>
+          <w:b w:val="0"/>
+          <w:sz w:val="22"/>
+        </w:rPr>
+        <w:t>: 1km 이내에서 강한 양의 기여, 3km 이후 기여 소멸 — 차량 10분권 프리미엄.</w:t>
+      </w:r>
+    </w:p>
+    <w:p>
+      <w:pPr>
+        <w:pStyle w:val="ListBullet"/>
+        <w:ind w:firstLine="0"/>
+      </w:pPr>
+      <w:r>
+        <w:rPr>
+          <w:rFonts w:ascii="바탕" w:hAnsi="바탕" w:eastAsia="바탕"/>
+          <w:b/>
+          <w:sz w:val="22"/>
+        </w:rPr>
+        <w:t>어린이집 1km 내 개수</w:t>
+      </w:r>
+      <w:r>
+        <w:rPr>
+          <w:rFonts w:ascii="바탕" w:hAnsi="바탕" w:eastAsia="바탕"/>
+          <w:b w:val="0"/>
+          <w:sz w:val="22"/>
+        </w:rPr>
+        <w:t>: 밀도 40 이상에서 기여 포화 — 생활권 성숙도 프록시.</w:t>
+      </w:r>
+    </w:p>
+    <w:p>
+      <w:r>
+        <w:rPr>
+          <w:rFonts w:ascii="바탕" w:hAnsi="바탕" w:eastAsia="바탕"/>
+          <w:b w:val="0"/>
+          <w:sz w:val="22"/>
+        </w:rPr>
+        <w:t>OLS가 선형 가정으로 이들 패턴을 평균 기울기로만 요약하는 데 비해, XGBoost는 각 구간의 비선형 반응을 데이터에서 직접 학습하고, SHAP은 이를 단위가 통일된 기여 신호로 분해해 해석 가능하게 만든다.</w:t>
+      </w:r>
+    </w:p>
+    <w:p>
+      <w:pPr>
+        <w:pStyle w:val="Heading2"/>
         <w:spacing w:before="360" w:after="240"/>
         <w:ind w:firstLine="0"/>
         <w:jc w:val="left"/>
@@ -19071,6 +19161,7 @@
     </w:p>
     <w:p>
       <w:pPr>
+        <w:pStyle w:val="Heading3"/>
         <w:spacing w:before="240" w:after="160"/>
         <w:ind w:firstLine="0"/>
         <w:jc w:val="left"/>
@@ -19479,6 +19570,7 @@
     </w:p>
     <w:p>
       <w:pPr>
+        <w:pStyle w:val="Heading3"/>
         <w:spacing w:before="240" w:after="160"/>
         <w:ind w:firstLine="0"/>
         <w:jc w:val="left"/>
@@ -19970,6 +20062,7 @@
     </w:p>
     <w:p>
       <w:pPr>
+        <w:pStyle w:val="Heading3"/>
         <w:spacing w:before="240" w:after="160"/>
         <w:ind w:firstLine="0"/>
         <w:jc w:val="left"/>
@@ -20111,6 +20204,7 @@
     </w:p>
     <w:p>
       <w:pPr>
+        <w:pStyle w:val="Heading2"/>
         <w:spacing w:before="360" w:after="240"/>
         <w:ind w:firstLine="0"/>
         <w:jc w:val="left"/>
@@ -20126,6 +20220,7 @@
     </w:p>
     <w:p>
       <w:pPr>
+        <w:pStyle w:val="Heading3"/>
         <w:spacing w:before="240" w:after="160"/>
         <w:ind w:firstLine="0"/>
         <w:jc w:val="left"/>
@@ -21059,6 +21154,7 @@
     </w:p>
     <w:p>
       <w:pPr>
+        <w:pStyle w:val="Heading3"/>
         <w:spacing w:before="240" w:after="160"/>
         <w:ind w:firstLine="0"/>
         <w:jc w:val="left"/>
@@ -22178,6 +22274,7 @@
     </w:p>
     <w:p>
       <w:pPr>
+        <w:pStyle w:val="Heading2"/>
         <w:spacing w:before="360" w:after="240"/>
         <w:ind w:firstLine="0"/>
         <w:jc w:val="left"/>
@@ -22193,6 +22290,7 @@
     </w:p>
     <w:p>
       <w:pPr>
+        <w:pStyle w:val="Heading3"/>
         <w:spacing w:before="240" w:after="160"/>
         <w:ind w:firstLine="0"/>
         <w:jc w:val="left"/>
@@ -22994,6 +23092,7 @@
     </w:p>
     <w:p>
       <w:pPr>
+        <w:pStyle w:val="Heading3"/>
         <w:spacing w:before="240" w:after="160"/>
         <w:ind w:firstLine="0"/>
         <w:jc w:val="left"/>
@@ -23789,6 +23888,7 @@
     </w:p>
     <w:p>
       <w:pPr>
+        <w:pStyle w:val="Heading3"/>
         <w:spacing w:before="240" w:after="160"/>
         <w:ind w:firstLine="0"/>
         <w:jc w:val="left"/>
@@ -24994,6 +25094,7 @@
     </w:p>
     <w:p>
       <w:pPr>
+        <w:pStyle w:val="Heading3"/>
         <w:spacing w:before="240" w:after="160"/>
         <w:ind w:firstLine="0"/>
         <w:jc w:val="left"/>
@@ -25123,6 +25224,7 @@
     </w:p>
     <w:p>
       <w:pPr>
+        <w:pStyle w:val="Heading1"/>
         <w:spacing w:before="480" w:after="360"/>
         <w:ind w:firstLine="0"/>
         <w:jc w:val="center"/>
@@ -25138,6 +25240,7 @@
     </w:p>
     <w:p>
       <w:pPr>
+        <w:pStyle w:val="Heading2"/>
         <w:spacing w:before="360" w:after="240"/>
         <w:ind w:firstLine="0"/>
         <w:jc w:val="left"/>
@@ -25465,6 +25568,7 @@
     </w:p>
     <w:p>
       <w:pPr>
+        <w:pStyle w:val="Heading2"/>
         <w:spacing w:before="360" w:after="240"/>
         <w:ind w:firstLine="0"/>
         <w:jc w:val="left"/>
@@ -25480,6 +25584,7 @@
     </w:p>
     <w:p>
       <w:pPr>
+        <w:pStyle w:val="Heading3"/>
         <w:spacing w:before="240" w:after="160"/>
         <w:ind w:firstLine="0"/>
         <w:jc w:val="left"/>
@@ -25613,6 +25718,7 @@
     </w:p>
     <w:p>
       <w:pPr>
+        <w:pStyle w:val="Heading3"/>
         <w:spacing w:before="240" w:after="160"/>
         <w:ind w:firstLine="0"/>
         <w:jc w:val="left"/>
@@ -25732,6 +25838,7 @@
     </w:p>
     <w:p>
       <w:pPr>
+        <w:pStyle w:val="Heading2"/>
         <w:spacing w:before="360" w:after="240"/>
         <w:ind w:firstLine="0"/>
         <w:jc w:val="left"/>
@@ -25974,6 +26081,7 @@
     </w:p>
     <w:p>
       <w:pPr>
+        <w:pStyle w:val="Heading1"/>
         <w:spacing w:before="480" w:after="360"/>
         <w:ind w:firstLine="0"/>
         <w:jc w:val="center"/>
@@ -25989,6 +26097,7 @@
     </w:p>
     <w:p>
       <w:pPr>
+        <w:pStyle w:val="Heading2"/>
         <w:spacing w:before="360" w:after="240"/>
         <w:ind w:firstLine="0"/>
         <w:jc w:val="left"/>
@@ -26003,147 +26112,204 @@
       </w:r>
     </w:p>
     <w:p>
+      <w:pPr>
+        <w:pStyle w:val="ListBullet"/>
+        <w:ind w:firstLine="0"/>
+      </w:pPr>
       <w:r>
         <w:rPr>
           <w:rFonts w:ascii="바탕" w:hAnsi="바탕" w:eastAsia="바탕"/>
           <w:b w:val="0"/>
           <w:sz w:val="22"/>
         </w:rPr>
-        <w:t>- 김명진, 서원석 (2023). 코로나19에 따른 유형별 소매유통시설의 아파트 가격 영향: 전역적·국지적 시계열 효과를 중심으로. *토지주택연구*, 14(3), 37-53.</w:t>
-      </w:r>
-    </w:p>
-    <w:p>
-      <w:r>
-        <w:rPr>
-          <w:rFonts w:ascii="바탕" w:hAnsi="바탕" w:eastAsia="바탕"/>
-          <w:b w:val="0"/>
-          <w:sz w:val="22"/>
-        </w:rPr>
-        <w:t>- 김우성, 이시온, 장현수, 김재완, 홍정의 (2019). 헤도닉 가격 모형을 통한 주거 선호의 구조 변화 분석: 2006-2017년 강남 지역 아파트를 중심으로. *부동산학보*, 76, 137-150.</w:t>
-      </w:r>
-    </w:p>
-    <w:p>
-      <w:r>
-        <w:rPr>
-          <w:rFonts w:ascii="바탕" w:hAnsi="바탕" w:eastAsia="바탕"/>
-          <w:b w:val="0"/>
-          <w:sz w:val="22"/>
-        </w:rPr>
-        <w:t>- 김이환, 김형준, 류두진, 조훈 (2022). 기계학습 방법론을 활용한 아파트 매매가격지수 연구. *부동산분석*, 8(3), 1-29.</w:t>
-      </w:r>
-    </w:p>
-    <w:p>
-      <w:r>
-        <w:rPr>
-          <w:rFonts w:ascii="바탕" w:hAnsi="바탕" w:eastAsia="바탕"/>
-          <w:b w:val="0"/>
-          <w:sz w:val="22"/>
-        </w:rPr>
-        <w:t>- 김학현, 유환규, 오하영 (2023). 딥러닝과 머신러닝을 이용한 아파트 실거래가 예측. *정보처리학회 논문지*, 12(2), 59-76.</w:t>
-      </w:r>
-    </w:p>
-    <w:p>
-      <w:r>
-        <w:rPr>
-          <w:rFonts w:ascii="바탕" w:hAnsi="바탕" w:eastAsia="바탕"/>
-          <w:b w:val="0"/>
-          <w:sz w:val="22"/>
-        </w:rPr>
-        <w:t>- 노산하, 신진호 (2021). 검색빈도를 이용한 종합부동산세 및 재산세의 주택가격 인하효과 분석. *국토연구*, 110, 81-93.</w:t>
-      </w:r>
-    </w:p>
-    <w:p>
-      <w:r>
-        <w:rPr>
-          <w:rFonts w:ascii="바탕" w:hAnsi="바탕" w:eastAsia="바탕"/>
-          <w:b w:val="0"/>
-          <w:sz w:val="22"/>
-        </w:rPr>
-        <w:t>- 배성완, 유정석 (2018). 머신 러닝 방법과 시계열 분석 모형을 이용한 부동산 가격지수 예측. *주택연구*, 26(1), 107-133.</w:t>
-      </w:r>
-    </w:p>
-    <w:p>
-      <w:r>
-        <w:rPr>
-          <w:rFonts w:ascii="바탕" w:hAnsi="바탕" w:eastAsia="바탕"/>
-          <w:b w:val="0"/>
-          <w:sz w:val="22"/>
-        </w:rPr>
-        <w:t>- 배종찬, 정재호 (2021). 거시경제와 부동산정책이 서울 아파트가격에 미치는 영향 연구. *토지주택연구*, 12(4), 41-59.</w:t>
-      </w:r>
-    </w:p>
-    <w:p>
-      <w:r>
-        <w:rPr>
-          <w:rFonts w:ascii="바탕" w:hAnsi="바탕" w:eastAsia="바탕"/>
-          <w:b w:val="0"/>
-          <w:sz w:val="22"/>
-        </w:rPr>
-        <w:t>- 신광문, 이재수 (2019). 공간 헤도닉 가격 모형을 적용한 소형주택의 임대료 결정 요인. *부동산분석*, 5(3), 49-66.</w:t>
-      </w:r>
-    </w:p>
-    <w:p>
-      <w:r>
-        <w:rPr>
-          <w:rFonts w:ascii="바탕" w:hAnsi="바탕" w:eastAsia="바탕"/>
-          <w:b w:val="0"/>
-          <w:sz w:val="22"/>
-        </w:rPr>
-        <w:t>- 이선구 (2025). XGBoost 기반 부동산 자동가치산정모형(AVM)의 실증 분석: 은평구 다세대주택 실거래가를 중심으로. *부동산분석*, 11(2), 21-40.</w:t>
-      </w:r>
-    </w:p>
-    <w:p>
-      <w:r>
-        <w:rPr>
-          <w:rFonts w:ascii="바탕" w:hAnsi="바탕" w:eastAsia="바탕"/>
-          <w:b w:val="0"/>
-          <w:sz w:val="22"/>
-        </w:rPr>
-        <w:t>- 장희선, 최성록, 엄영숙 (2021). 공간헤도닉가격모형을 적용한 서울시민들의 도시공원 서비스에 대한 편익측정. *국토계획*, 56(5), 215-227.</w:t>
-      </w:r>
-    </w:p>
-    <w:p>
-      <w:r>
-        <w:rPr>
-          <w:rFonts w:ascii="바탕" w:hAnsi="바탕" w:eastAsia="바탕"/>
-          <w:b w:val="0"/>
-          <w:sz w:val="22"/>
-        </w:rPr>
-        <w:t>- 정진오, 정재호 (2023). 부동산정책이 부동산가격에 미치는 영향에 관한 연구: 조세정책과 금융정책 중심으로. *토지주택연구*, 14(3), 55-75.</w:t>
-      </w:r>
-    </w:p>
-    <w:p>
-      <w:r>
-        <w:rPr>
-          <w:rFonts w:ascii="바탕" w:hAnsi="바탕" w:eastAsia="바탕"/>
-          <w:b w:val="0"/>
-          <w:sz w:val="22"/>
-        </w:rPr>
-        <w:t>- 조보근, 박경배, 하성호 (2020). 기계학습 알고리즘을 활용한 지역별 아파트 실거래가격지수 예측모델 비교: LIME 해석력 검증. *정보시스템연구*, 29(3), 119-144.</w:t>
-      </w:r>
-    </w:p>
-    <w:p>
-      <w:r>
-        <w:rPr>
-          <w:rFonts w:ascii="바탕" w:hAnsi="바탕" w:eastAsia="바탕"/>
-          <w:b w:val="0"/>
-          <w:sz w:val="22"/>
-        </w:rPr>
-        <w:t>- 진수정 (2024). 그래프 신경망(SRGCNN)을 활용한 서울시 아파트 매매가격 예측. 서울대학교 대학원 석사학위논문.</w:t>
-      </w:r>
-    </w:p>
-    <w:p>
-      <w:r>
-        <w:rPr>
-          <w:rFonts w:ascii="바탕" w:hAnsi="바탕" w:eastAsia="바탕"/>
-          <w:b w:val="0"/>
-          <w:sz w:val="22"/>
-        </w:rPr>
-        <w:t>- 통계청 (2024). 가계금융복지조사 결과. 통계청.</w:t>
+        <w:t>김명진, 서원석 (2023). 코로나19에 따른 유형별 소매유통시설의 아파트 가격 영향: 전역적·국지적 시계열 효과를 중심으로. *토지주택연구*, 14(3), 37-53.</w:t>
       </w:r>
     </w:p>
     <w:p>
       <w:pPr>
+        <w:pStyle w:val="ListBullet"/>
+        <w:ind w:firstLine="0"/>
+      </w:pPr>
+      <w:r>
+        <w:rPr>
+          <w:rFonts w:ascii="바탕" w:hAnsi="바탕" w:eastAsia="바탕"/>
+          <w:b w:val="0"/>
+          <w:sz w:val="22"/>
+        </w:rPr>
+        <w:t>김우성, 이시온, 장현수, 김재완, 홍정의 (2019). 헤도닉 가격 모형을 통한 주거 선호의 구조 변화 분석: 2006-2017년 강남 지역 아파트를 중심으로. *부동산학보*, 76, 137-150.</w:t>
+      </w:r>
+    </w:p>
+    <w:p>
+      <w:pPr>
+        <w:pStyle w:val="ListBullet"/>
+        <w:ind w:firstLine="0"/>
+      </w:pPr>
+      <w:r>
+        <w:rPr>
+          <w:rFonts w:ascii="바탕" w:hAnsi="바탕" w:eastAsia="바탕"/>
+          <w:b w:val="0"/>
+          <w:sz w:val="22"/>
+        </w:rPr>
+        <w:t>김이환, 김형준, 류두진, 조훈 (2022). 기계학습 방법론을 활용한 아파트 매매가격지수 연구. *부동산분석*, 8(3), 1-29.</w:t>
+      </w:r>
+    </w:p>
+    <w:p>
+      <w:pPr>
+        <w:pStyle w:val="ListBullet"/>
+        <w:ind w:firstLine="0"/>
+      </w:pPr>
+      <w:r>
+        <w:rPr>
+          <w:rFonts w:ascii="바탕" w:hAnsi="바탕" w:eastAsia="바탕"/>
+          <w:b w:val="0"/>
+          <w:sz w:val="22"/>
+        </w:rPr>
+        <w:t>김학현, 유환규, 오하영 (2023). 딥러닝과 머신러닝을 이용한 아파트 실거래가 예측. *정보처리학회 논문지*, 12(2), 59-76.</w:t>
+      </w:r>
+    </w:p>
+    <w:p>
+      <w:pPr>
+        <w:pStyle w:val="ListBullet"/>
+        <w:ind w:firstLine="0"/>
+      </w:pPr>
+      <w:r>
+        <w:rPr>
+          <w:rFonts w:ascii="바탕" w:hAnsi="바탕" w:eastAsia="바탕"/>
+          <w:b w:val="0"/>
+          <w:sz w:val="22"/>
+        </w:rPr>
+        <w:t>노산하, 신진호 (2021). 검색빈도를 이용한 종합부동산세 및 재산세의 주택가격 인하효과 분석. *국토연구*, 110, 81-93.</w:t>
+      </w:r>
+    </w:p>
+    <w:p>
+      <w:pPr>
+        <w:pStyle w:val="ListBullet"/>
+        <w:ind w:firstLine="0"/>
+      </w:pPr>
+      <w:r>
+        <w:rPr>
+          <w:rFonts w:ascii="바탕" w:hAnsi="바탕" w:eastAsia="바탕"/>
+          <w:b w:val="0"/>
+          <w:sz w:val="22"/>
+        </w:rPr>
+        <w:t>배성완, 유정석 (2018). 머신 러닝 방법과 시계열 분석 모형을 이용한 부동산 가격지수 예측. *주택연구*, 26(1), 107-133.</w:t>
+      </w:r>
+    </w:p>
+    <w:p>
+      <w:pPr>
+        <w:pStyle w:val="ListBullet"/>
+        <w:ind w:firstLine="0"/>
+      </w:pPr>
+      <w:r>
+        <w:rPr>
+          <w:rFonts w:ascii="바탕" w:hAnsi="바탕" w:eastAsia="바탕"/>
+          <w:b w:val="0"/>
+          <w:sz w:val="22"/>
+        </w:rPr>
+        <w:t>배종찬, 정재호 (2021). 거시경제와 부동산정책이 서울 아파트가격에 미치는 영향 연구. *토지주택연구*, 12(4), 41-59.</w:t>
+      </w:r>
+    </w:p>
+    <w:p>
+      <w:pPr>
+        <w:pStyle w:val="ListBullet"/>
+        <w:ind w:firstLine="0"/>
+      </w:pPr>
+      <w:r>
+        <w:rPr>
+          <w:rFonts w:ascii="바탕" w:hAnsi="바탕" w:eastAsia="바탕"/>
+          <w:b w:val="0"/>
+          <w:sz w:val="22"/>
+        </w:rPr>
+        <w:t>신광문, 이재수 (2019). 공간 헤도닉 가격 모형을 적용한 소형주택의 임대료 결정 요인. *부동산분석*, 5(3), 49-66.</w:t>
+      </w:r>
+    </w:p>
+    <w:p>
+      <w:pPr>
+        <w:pStyle w:val="ListBullet"/>
+        <w:ind w:firstLine="0"/>
+      </w:pPr>
+      <w:r>
+        <w:rPr>
+          <w:rFonts w:ascii="바탕" w:hAnsi="바탕" w:eastAsia="바탕"/>
+          <w:b w:val="0"/>
+          <w:sz w:val="22"/>
+        </w:rPr>
+        <w:t>이선구 (2025). XGBoost 기반 부동산 자동가치산정모형(AVM)의 실증 분석: 은평구 다세대주택 실거래가를 중심으로. *부동산분석*, 11(2), 21-40.</w:t>
+      </w:r>
+    </w:p>
+    <w:p>
+      <w:pPr>
+        <w:pStyle w:val="ListBullet"/>
+        <w:ind w:firstLine="0"/>
+      </w:pPr>
+      <w:r>
+        <w:rPr>
+          <w:rFonts w:ascii="바탕" w:hAnsi="바탕" w:eastAsia="바탕"/>
+          <w:b w:val="0"/>
+          <w:sz w:val="22"/>
+        </w:rPr>
+        <w:t>장희선, 최성록, 엄영숙 (2021). 공간헤도닉가격모형을 적용한 서울시민들의 도시공원 서비스에 대한 편익측정. *국토계획*, 56(5), 215-227.</w:t>
+      </w:r>
+    </w:p>
+    <w:p>
+      <w:pPr>
+        <w:pStyle w:val="ListBullet"/>
+        <w:ind w:firstLine="0"/>
+      </w:pPr>
+      <w:r>
+        <w:rPr>
+          <w:rFonts w:ascii="바탕" w:hAnsi="바탕" w:eastAsia="바탕"/>
+          <w:b w:val="0"/>
+          <w:sz w:val="22"/>
+        </w:rPr>
+        <w:t>정진오, 정재호 (2023). 부동산정책이 부동산가격에 미치는 영향에 관한 연구: 조세정책과 금융정책 중심으로. *토지주택연구*, 14(3), 55-75.</w:t>
+      </w:r>
+    </w:p>
+    <w:p>
+      <w:pPr>
+        <w:pStyle w:val="ListBullet"/>
+        <w:ind w:firstLine="0"/>
+      </w:pPr>
+      <w:r>
+        <w:rPr>
+          <w:rFonts w:ascii="바탕" w:hAnsi="바탕" w:eastAsia="바탕"/>
+          <w:b w:val="0"/>
+          <w:sz w:val="22"/>
+        </w:rPr>
+        <w:t>조보근, 박경배, 하성호 (2020). 기계학습 알고리즘을 활용한 지역별 아파트 실거래가격지수 예측모델 비교: LIME 해석력 검증. *정보시스템연구*, 29(3), 119-144.</w:t>
+      </w:r>
+    </w:p>
+    <w:p>
+      <w:pPr>
+        <w:pStyle w:val="ListBullet"/>
+        <w:ind w:firstLine="0"/>
+      </w:pPr>
+      <w:r>
+        <w:rPr>
+          <w:rFonts w:ascii="바탕" w:hAnsi="바탕" w:eastAsia="바탕"/>
+          <w:b w:val="0"/>
+          <w:sz w:val="22"/>
+        </w:rPr>
+        <w:t>진수정 (2024). 그래프 신경망(SRGCNN)을 활용한 서울시 아파트 매매가격 예측. 서울대학교 대학원 석사학위논문.</w:t>
+      </w:r>
+    </w:p>
+    <w:p>
+      <w:pPr>
+        <w:pStyle w:val="ListBullet"/>
+        <w:ind w:firstLine="0"/>
+      </w:pPr>
+      <w:r>
+        <w:rPr>
+          <w:rFonts w:ascii="바탕" w:hAnsi="바탕" w:eastAsia="바탕"/>
+          <w:b w:val="0"/>
+          <w:sz w:val="22"/>
+        </w:rPr>
+        <w:t>통계청 (2024). 가계금융복지조사 결과. 통계청.</w:t>
+      </w:r>
+    </w:p>
+    <w:p>
+      <w:pPr>
+        <w:pStyle w:val="Heading2"/>
         <w:spacing w:before="360" w:after="240"/>
         <w:ind w:firstLine="0"/>
         <w:jc w:val="left"/>
@@ -26158,272 +26324,377 @@
       </w:r>
     </w:p>
     <w:p>
+      <w:pPr>
+        <w:pStyle w:val="ListBullet"/>
+        <w:ind w:firstLine="0"/>
+      </w:pPr>
       <w:r>
         <w:rPr>
           <w:rFonts w:ascii="바탕" w:hAnsi="바탕" w:eastAsia="바탕"/>
           <w:b w:val="0"/>
           <w:sz w:val="22"/>
         </w:rPr>
-        <w:t>- An, S., Song, Y., Jang, H. &amp; Ahn, K. (2025). Toward transparent and accurate housing price appraisal: Hedonic price models versus machine learning algorithms. *Financial Innovation*, 11, Article 141.</w:t>
-      </w:r>
-    </w:p>
-    <w:p>
-      <w:r>
-        <w:rPr>
-          <w:rFonts w:ascii="바탕" w:hAnsi="바탕" w:eastAsia="바탕"/>
-          <w:b w:val="0"/>
-          <w:sz w:val="22"/>
-        </w:rPr>
-        <w:t>- Anselin, L. (1988). *Spatial Econometrics: Methods and Models*. Dordrecht: Kluwer Academic Publishers.</w:t>
-      </w:r>
-    </w:p>
-    <w:p>
-      <w:r>
-        <w:rPr>
-          <w:rFonts w:ascii="바탕" w:hAnsi="바탕" w:eastAsia="바탕"/>
-          <w:b w:val="0"/>
-          <w:sz w:val="22"/>
-        </w:rPr>
-        <w:t>- Breiman, L. (2001). Random forests. *Machine Learning*, 45(1), 5-32.</w:t>
-      </w:r>
-    </w:p>
-    <w:p>
-      <w:r>
-        <w:rPr>
-          <w:rFonts w:ascii="바탕" w:hAnsi="바탕" w:eastAsia="바탕"/>
-          <w:b w:val="0"/>
-          <w:sz w:val="22"/>
-        </w:rPr>
-        <w:t>- Čeh, M., Kilibarda, M., Lisec, A. &amp; Bajat, B. (2018). Estimating the performance of random forest versus multiple regression for predicting prices of the apartments. *ISPRS International Journal of Geo-Information*, 7(5), 168.</w:t>
-      </w:r>
-    </w:p>
-    <w:p>
-      <w:r>
-        <w:rPr>
-          <w:rFonts w:ascii="바탕" w:hAnsi="바탕" w:eastAsia="바탕"/>
-          <w:b w:val="0"/>
-          <w:sz w:val="22"/>
-        </w:rPr>
-        <w:t>- Chen, T. &amp; Guestrin, C. (2016). XGBoost: A scalable tree boosting system. In *Proceedings of the 22nd ACM SIGKDD International Conference on Knowledge Discovery and Data Mining* (pp. 785-794).</w:t>
-      </w:r>
-    </w:p>
-    <w:p>
-      <w:r>
-        <w:rPr>
-          <w:rFonts w:ascii="바탕" w:hAnsi="바탕" w:eastAsia="바탕"/>
-          <w:b w:val="0"/>
-          <w:sz w:val="22"/>
-        </w:rPr>
-        <w:t>- Choy, L. H. T. &amp; Ho, W. K. O. (2023). The use of machine learning in real estate research. *Land*, 12(4), 740.</w:t>
-      </w:r>
-    </w:p>
-    <w:p>
-      <w:r>
-        <w:rPr>
-          <w:rFonts w:ascii="바탕" w:hAnsi="바탕" w:eastAsia="바탕"/>
-          <w:b w:val="0"/>
-          <w:sz w:val="22"/>
-        </w:rPr>
-        <w:t>- Chun, H. J., Lee, U. H. &amp; Lee, B. G. (2025). Predicting housing price in Seoul using explainable AI (XAI) and machine learning. *KSII Transactions on Internet and Information Systems*, 19(4), 1077-1096.</w:t>
-      </w:r>
-    </w:p>
-    <w:p>
-      <w:r>
-        <w:rPr>
-          <w:rFonts w:ascii="바탕" w:hAnsi="바탕" w:eastAsia="바탕"/>
-          <w:b w:val="0"/>
-          <w:sz w:val="22"/>
-        </w:rPr>
-        <w:t>- Friedman, J. H. (2001). Greedy function approximation: A gradient boosting machine. *Annals of Statistics*, 29(5), 1189-1232.</w:t>
-      </w:r>
-    </w:p>
-    <w:p>
-      <w:r>
-        <w:rPr>
-          <w:rFonts w:ascii="바탕" w:hAnsi="바탕" w:eastAsia="바탕"/>
-          <w:b w:val="0"/>
-          <w:sz w:val="22"/>
-        </w:rPr>
-        <w:t>- James, G., Witten, D., Hastie, T. &amp; Tibshirani, R. (2013). *An Introduction to Statistical Learning* (1st ed.). New York: Springer.</w:t>
-      </w:r>
-    </w:p>
-    <w:p>
-      <w:r>
-        <w:rPr>
-          <w:rFonts w:ascii="바탕" w:hAnsi="바탕" w:eastAsia="바탕"/>
-          <w:b w:val="0"/>
-          <w:sz w:val="22"/>
-        </w:rPr>
-        <w:t>- Hastie, T., Tibshirani, R. &amp; Friedman, J. (2009). *The Elements of Statistical Learning* (2nd ed.). New York: Springer.</w:t>
-      </w:r>
-    </w:p>
-    <w:p>
-      <w:r>
-        <w:rPr>
-          <w:rFonts w:ascii="바탕" w:hAnsi="바탕" w:eastAsia="바탕"/>
-          <w:b w:val="0"/>
-          <w:sz w:val="22"/>
-        </w:rPr>
-        <w:t>- Ke, G., Meng, Q., Finley, T., Wang, T., Chen, W., Ma, W., Ye, Q. &amp; Liu, T.-Y. (2017). LightGBM: A highly efficient gradient boosting decision tree. In *Advances in Neural Information Processing Systems* 30 (pp. 3146-3154).</w:t>
-      </w:r>
-    </w:p>
-    <w:p>
-      <w:r>
-        <w:rPr>
-          <w:rFonts w:ascii="바탕" w:hAnsi="바탕" w:eastAsia="바탕"/>
-          <w:b w:val="0"/>
-          <w:sz w:val="22"/>
-        </w:rPr>
-        <w:t>- Kim, J.-J., Cho, M. &amp; Lee, M.-H. (2022). An analysis of the price determinants of multiplex houses through spatial regression analysis. *Sustainability*, 14(12), 7116.</w:t>
-      </w:r>
-    </w:p>
-    <w:p>
-      <w:r>
-        <w:rPr>
-          <w:rFonts w:ascii="바탕" w:hAnsi="바탕" w:eastAsia="바탕"/>
-          <w:b w:val="0"/>
-          <w:sz w:val="22"/>
-        </w:rPr>
-        <w:t>- Kim, W., Choi, I. &amp; Lee, M. (2025). Explainable AI-based mass appraisal: Insights from machine learning applications in Korea's residential property market. *International Journal of Strategic Property Management*, 29(5), 350-376.</w:t>
-      </w:r>
-    </w:p>
-    <w:p>
-      <w:r>
-        <w:rPr>
-          <w:rFonts w:ascii="바탕" w:hAnsi="바탕" w:eastAsia="바탕"/>
-          <w:b w:val="0"/>
-          <w:sz w:val="22"/>
-        </w:rPr>
-        <w:t>- Lancaster, K. J. (1966). A new approach to consumer theory. *Journal of Political Economy*, 74(2), 132-157.</w:t>
-      </w:r>
-    </w:p>
-    <w:p>
-      <w:r>
-        <w:rPr>
-          <w:rFonts w:ascii="바탕" w:hAnsi="바탕" w:eastAsia="바탕"/>
-          <w:b w:val="0"/>
-          <w:sz w:val="22"/>
-        </w:rPr>
-        <w:t>- Malpezzi, S. (2003). Hedonic pricing models: A selective and applied review. In T. O'Sullivan &amp; K. Gibb (Eds.), *Housing Economics and Public Policy* (pp. 67-89). Oxford: Blackwell Science.</w:t>
-      </w:r>
-    </w:p>
-    <w:p>
-      <w:r>
-        <w:rPr>
-          <w:rFonts w:ascii="바탕" w:hAnsi="바탕" w:eastAsia="바탕"/>
-          <w:b w:val="0"/>
-          <w:sz w:val="22"/>
-        </w:rPr>
-        <w:t>- Sirmans, G. S., Macpherson, D. A. &amp; Zietz, E. N. (2005). The composition of hedonic pricing models. *Journal of Real Estate Literature*, 13(1), 3-43.</w:t>
-      </w:r>
-    </w:p>
-    <w:p>
-      <w:r>
-        <w:rPr>
-          <w:rFonts w:ascii="바탕" w:hAnsi="바탕" w:eastAsia="바탕"/>
-          <w:b w:val="0"/>
-          <w:sz w:val="22"/>
-        </w:rPr>
-        <w:t>- Limsombunchai, V. (2004). House price prediction: Hedonic price model vs. artificial neural network. In *Proceedings of the New Zealand Agricultural and Resource Economics Society (NZARES) Conference*. Blenheim, New Zealand.</w:t>
-      </w:r>
-    </w:p>
-    <w:p>
-      <w:r>
-        <w:rPr>
-          <w:rFonts w:ascii="바탕" w:hAnsi="바탕" w:eastAsia="바탕"/>
-          <w:b w:val="0"/>
-          <w:sz w:val="22"/>
-        </w:rPr>
-        <w:t>- Lundberg, S. M. &amp; Lee, S.-I. (2017). A unified approach to interpreting model predictions. In *Advances in Neural Information Processing Systems* 30 (pp. 4765-4774).</w:t>
-      </w:r>
-    </w:p>
-    <w:p>
-      <w:r>
-        <w:rPr>
-          <w:rFonts w:ascii="바탕" w:hAnsi="바탕" w:eastAsia="바탕"/>
-          <w:b w:val="0"/>
-          <w:sz w:val="22"/>
-        </w:rPr>
-        <w:t>- Lundberg, S. M., Erion, G., Chen, H., DeGrave, A., Prutkin, J. M., Nair, B., Katz, R., Himmelfarb, J., Bansal, N. &amp; Lee, S.-I. (2020). From local explanations to global understanding with explainable AI for trees. *Nature Machine Intelligence*, 2(1), 56-67.</w:t>
-      </w:r>
-    </w:p>
-    <w:p>
-      <w:r>
-        <w:rPr>
-          <w:rFonts w:ascii="바탕" w:hAnsi="바탕" w:eastAsia="바탕"/>
-          <w:b w:val="0"/>
-          <w:sz w:val="22"/>
-        </w:rPr>
-        <w:t>- Mora-García, R. T., Cespedes-Lopez, M. F. &amp; Pérez-Sánchez, V. R. (2022). Housing price prediction using machine learning algorithms in COVID-19 times. *Land*, 11(11), 2100.</w:t>
-      </w:r>
-    </w:p>
-    <w:p>
-      <w:r>
-        <w:rPr>
-          <w:rFonts w:ascii="바탕" w:hAnsi="바탕" w:eastAsia="바탕"/>
-          <w:b w:val="0"/>
-          <w:sz w:val="22"/>
-        </w:rPr>
-        <w:t>- Neves, F. T., Aparicio, M. &amp; de Castro Neto, M. (2024). The impacts of open data and explainable AI on real estate price predictions in smart cities. *Applied Sciences*, 14(5), 2209.</w:t>
-      </w:r>
-    </w:p>
-    <w:p>
-      <w:r>
-        <w:rPr>
-          <w:rFonts w:ascii="바탕" w:hAnsi="바탕" w:eastAsia="바탕"/>
-          <w:b w:val="0"/>
-          <w:sz w:val="22"/>
-        </w:rPr>
-        <w:t>- Ezil Sam Leni, A., Revathi, T. &amp; Devarajan, S. (2025). A robust ensemble-based framework for house price estimation: Integrating XG-Boost with SHAP and web deployment. *ITM Web of Conferences*, 79, 01023.</w:t>
-      </w:r>
-    </w:p>
-    <w:p>
-      <w:r>
-        <w:rPr>
-          <w:rFonts w:ascii="바탕" w:hAnsi="바탕" w:eastAsia="바탕"/>
-          <w:b w:val="0"/>
-          <w:sz w:val="22"/>
-        </w:rPr>
-        <w:t>- Ribeiro, M. T., Singh, S. &amp; Guestrin, C. (2016). "Why should I trust you?": Explaining the predictions of any classifier. In *Proceedings of the 22nd ACM SIGKDD International Conference on Knowledge Discovery and Data Mining* (pp. 1135-1144).</w:t>
-      </w:r>
-    </w:p>
-    <w:p>
-      <w:r>
-        <w:rPr>
-          <w:rFonts w:ascii="바탕" w:hAnsi="바탕" w:eastAsia="바탕"/>
-          <w:b w:val="0"/>
-          <w:sz w:val="22"/>
-        </w:rPr>
-        <w:t>- Rosen, S. (1974). Hedonic prices and implicit markets: Product differentiation in pure competition. *Journal of Political Economy*, 82(1), 34-55.</w:t>
-      </w:r>
-    </w:p>
-    <w:p>
-      <w:r>
-        <w:rPr>
-          <w:rFonts w:ascii="바탕" w:hAnsi="바탕" w:eastAsia="바탕"/>
-          <w:b w:val="0"/>
-          <w:sz w:val="22"/>
-        </w:rPr>
-        <w:t>- Shahhosseini, M., Hu, G. &amp; Pham, H. (2022). Optimizing ensemble weights and hyperparameters of machine learning models for regression problems. *Machine Learning with Applications*, 7, 100251.</w:t>
-      </w:r>
-    </w:p>
-    <w:p>
-      <w:r>
-        <w:rPr>
-          <w:rFonts w:ascii="바탕" w:hAnsi="바탕" w:eastAsia="바탕"/>
-          <w:b w:val="0"/>
-          <w:sz w:val="22"/>
-        </w:rPr>
-        <w:t>- Tarasov, S. &amp; Dessoulavy-Śliwiński, B. (2025). Algorithm-driven hedonic real estate pricing – an explainable AI approach. *Real Estate Management and Valuation*, 33(1), 22-34.</w:t>
-      </w:r>
-    </w:p>
-    <w:p>
-      <w:r>
-        <w:br w:type="page"/>
+        <w:t>An, S., Song, Y., Jang, H. &amp; Ahn, K. (2025). Toward transparent and accurate housing price appraisal: Hedonic price models versus machine learning algorithms. *Financial Innovation*, 11, Article 141.</w:t>
       </w:r>
     </w:p>
     <w:p>
       <w:pPr>
+        <w:pStyle w:val="ListBullet"/>
+        <w:ind w:firstLine="0"/>
+      </w:pPr>
+      <w:r>
+        <w:rPr>
+          <w:rFonts w:ascii="바탕" w:hAnsi="바탕" w:eastAsia="바탕"/>
+          <w:b w:val="0"/>
+          <w:sz w:val="22"/>
+        </w:rPr>
+        <w:t>Anselin, L. (1988). *Spatial Econometrics: Methods and Models*. Dordrecht: Kluwer Academic Publishers.</w:t>
+      </w:r>
+    </w:p>
+    <w:p>
+      <w:pPr>
+        <w:pStyle w:val="ListBullet"/>
+        <w:ind w:firstLine="0"/>
+      </w:pPr>
+      <w:r>
+        <w:rPr>
+          <w:rFonts w:ascii="바탕" w:hAnsi="바탕" w:eastAsia="바탕"/>
+          <w:b w:val="0"/>
+          <w:sz w:val="22"/>
+        </w:rPr>
+        <w:t>Breiman, L. (2001). Random forests. *Machine Learning*, 45(1), 5-32.</w:t>
+      </w:r>
+    </w:p>
+    <w:p>
+      <w:pPr>
+        <w:pStyle w:val="ListBullet"/>
+        <w:ind w:firstLine="0"/>
+      </w:pPr>
+      <w:r>
+        <w:rPr>
+          <w:rFonts w:ascii="바탕" w:hAnsi="바탕" w:eastAsia="바탕"/>
+          <w:b w:val="0"/>
+          <w:sz w:val="22"/>
+        </w:rPr>
+        <w:t>Čeh, M., Kilibarda, M., Lisec, A. &amp; Bajat, B. (2018). Estimating the performance of random forest versus multiple regression for predicting prices of the apartments. *ISPRS International Journal of Geo-Information*, 7(5), 168.</w:t>
+      </w:r>
+    </w:p>
+    <w:p>
+      <w:pPr>
+        <w:pStyle w:val="ListBullet"/>
+        <w:ind w:firstLine="0"/>
+      </w:pPr>
+      <w:r>
+        <w:rPr>
+          <w:rFonts w:ascii="바탕" w:hAnsi="바탕" w:eastAsia="바탕"/>
+          <w:b w:val="0"/>
+          <w:sz w:val="22"/>
+        </w:rPr>
+        <w:t>Chen, T. &amp; Guestrin, C. (2016). XGBoost: A scalable tree boosting system. In *Proceedings of the 22nd ACM SIGKDD International Conference on Knowledge Discovery and Data Mining* (pp. 785-794).</w:t>
+      </w:r>
+    </w:p>
+    <w:p>
+      <w:pPr>
+        <w:pStyle w:val="ListBullet"/>
+        <w:ind w:firstLine="0"/>
+      </w:pPr>
+      <w:r>
+        <w:rPr>
+          <w:rFonts w:ascii="바탕" w:hAnsi="바탕" w:eastAsia="바탕"/>
+          <w:b w:val="0"/>
+          <w:sz w:val="22"/>
+        </w:rPr>
+        <w:t>Choy, L. H. T. &amp; Ho, W. K. O. (2023). The use of machine learning in real estate research. *Land*, 12(4), 740.</w:t>
+      </w:r>
+    </w:p>
+    <w:p>
+      <w:pPr>
+        <w:pStyle w:val="ListBullet"/>
+        <w:ind w:firstLine="0"/>
+      </w:pPr>
+      <w:r>
+        <w:rPr>
+          <w:rFonts w:ascii="바탕" w:hAnsi="바탕" w:eastAsia="바탕"/>
+          <w:b w:val="0"/>
+          <w:sz w:val="22"/>
+        </w:rPr>
+        <w:t>Chun, H. J., Lee, U. H. &amp; Lee, B. G. (2025). Predicting housing price in Seoul using explainable AI (XAI) and machine learning. *KSII Transactions on Internet and Information Systems*, 19(4), 1077-1096.</w:t>
+      </w:r>
+    </w:p>
+    <w:p>
+      <w:pPr>
+        <w:pStyle w:val="ListBullet"/>
+        <w:ind w:firstLine="0"/>
+      </w:pPr>
+      <w:r>
+        <w:rPr>
+          <w:rFonts w:ascii="바탕" w:hAnsi="바탕" w:eastAsia="바탕"/>
+          <w:b w:val="0"/>
+          <w:sz w:val="22"/>
+        </w:rPr>
+        <w:t>Friedman, J. H. (2001). Greedy function approximation: A gradient boosting machine. *Annals of Statistics*, 29(5), 1189-1232.</w:t>
+      </w:r>
+    </w:p>
+    <w:p>
+      <w:pPr>
+        <w:pStyle w:val="ListBullet"/>
+        <w:ind w:firstLine="0"/>
+      </w:pPr>
+      <w:r>
+        <w:rPr>
+          <w:rFonts w:ascii="바탕" w:hAnsi="바탕" w:eastAsia="바탕"/>
+          <w:b w:val="0"/>
+          <w:sz w:val="22"/>
+        </w:rPr>
+        <w:t>James, G., Witten, D., Hastie, T. &amp; Tibshirani, R. (2013). *An Introduction to Statistical Learning* (1st ed.). New York: Springer.</w:t>
+      </w:r>
+    </w:p>
+    <w:p>
+      <w:pPr>
+        <w:pStyle w:val="ListBullet"/>
+        <w:ind w:firstLine="0"/>
+      </w:pPr>
+      <w:r>
+        <w:rPr>
+          <w:rFonts w:ascii="바탕" w:hAnsi="바탕" w:eastAsia="바탕"/>
+          <w:b w:val="0"/>
+          <w:sz w:val="22"/>
+        </w:rPr>
+        <w:t>Hastie, T., Tibshirani, R. &amp; Friedman, J. (2009). *The Elements of Statistical Learning* (2nd ed.). New York: Springer.</w:t>
+      </w:r>
+    </w:p>
+    <w:p>
+      <w:pPr>
+        <w:pStyle w:val="ListBullet"/>
+        <w:ind w:firstLine="0"/>
+      </w:pPr>
+      <w:r>
+        <w:rPr>
+          <w:rFonts w:ascii="바탕" w:hAnsi="바탕" w:eastAsia="바탕"/>
+          <w:b w:val="0"/>
+          <w:sz w:val="22"/>
+        </w:rPr>
+        <w:t>Ke, G., Meng, Q., Finley, T., Wang, T., Chen, W., Ma, W., Ye, Q. &amp; Liu, T.-Y. (2017). LightGBM: A highly efficient gradient boosting decision tree. In *Advances in Neural Information Processing Systems* 30 (pp. 3146-3154).</w:t>
+      </w:r>
+    </w:p>
+    <w:p>
+      <w:pPr>
+        <w:pStyle w:val="ListBullet"/>
+        <w:ind w:firstLine="0"/>
+      </w:pPr>
+      <w:r>
+        <w:rPr>
+          <w:rFonts w:ascii="바탕" w:hAnsi="바탕" w:eastAsia="바탕"/>
+          <w:b w:val="0"/>
+          <w:sz w:val="22"/>
+        </w:rPr>
+        <w:t>Kim, J.-J., Cho, M. &amp; Lee, M.-H. (2022). An analysis of the price determinants of multiplex houses through spatial regression analysis. *Sustainability*, 14(12), 7116.</w:t>
+      </w:r>
+    </w:p>
+    <w:p>
+      <w:pPr>
+        <w:pStyle w:val="ListBullet"/>
+        <w:ind w:firstLine="0"/>
+      </w:pPr>
+      <w:r>
+        <w:rPr>
+          <w:rFonts w:ascii="바탕" w:hAnsi="바탕" w:eastAsia="바탕"/>
+          <w:b w:val="0"/>
+          <w:sz w:val="22"/>
+        </w:rPr>
+        <w:t>Kim, W., Choi, I. &amp; Lee, M. (2025). Explainable AI-based mass appraisal: Insights from machine learning applications in Korea's residential property market. *International Journal of Strategic Property Management*, 29(5), 350-376.</w:t>
+      </w:r>
+    </w:p>
+    <w:p>
+      <w:pPr>
+        <w:pStyle w:val="ListBullet"/>
+        <w:ind w:firstLine="0"/>
+      </w:pPr>
+      <w:r>
+        <w:rPr>
+          <w:rFonts w:ascii="바탕" w:hAnsi="바탕" w:eastAsia="바탕"/>
+          <w:b w:val="0"/>
+          <w:sz w:val="22"/>
+        </w:rPr>
+        <w:t>Lancaster, K. J. (1966). A new approach to consumer theory. *Journal of Political Economy*, 74(2), 132-157.</w:t>
+      </w:r>
+    </w:p>
+    <w:p>
+      <w:pPr>
+        <w:pStyle w:val="ListBullet"/>
+        <w:ind w:firstLine="0"/>
+      </w:pPr>
+      <w:r>
+        <w:rPr>
+          <w:rFonts w:ascii="바탕" w:hAnsi="바탕" w:eastAsia="바탕"/>
+          <w:b w:val="0"/>
+          <w:sz w:val="22"/>
+        </w:rPr>
+        <w:t>Malpezzi, S. (2003). Hedonic pricing models: A selective and applied review. In T. O'Sullivan &amp; K. Gibb (Eds.), *Housing Economics and Public Policy* (pp. 67-89). Oxford: Blackwell Science.</w:t>
+      </w:r>
+    </w:p>
+    <w:p>
+      <w:pPr>
+        <w:pStyle w:val="ListBullet"/>
+        <w:ind w:firstLine="0"/>
+      </w:pPr>
+      <w:r>
+        <w:rPr>
+          <w:rFonts w:ascii="바탕" w:hAnsi="바탕" w:eastAsia="바탕"/>
+          <w:b w:val="0"/>
+          <w:sz w:val="22"/>
+        </w:rPr>
+        <w:t>Sirmans, G. S., Macpherson, D. A. &amp; Zietz, E. N. (2005). The composition of hedonic pricing models. *Journal of Real Estate Literature*, 13(1), 3-43.</w:t>
+      </w:r>
+    </w:p>
+    <w:p>
+      <w:pPr>
+        <w:pStyle w:val="ListBullet"/>
+        <w:ind w:firstLine="0"/>
+      </w:pPr>
+      <w:r>
+        <w:rPr>
+          <w:rFonts w:ascii="바탕" w:hAnsi="바탕" w:eastAsia="바탕"/>
+          <w:b w:val="0"/>
+          <w:sz w:val="22"/>
+        </w:rPr>
+        <w:t>Limsombunchai, V. (2004). House price prediction: Hedonic price model vs. artificial neural network. In *Proceedings of the New Zealand Agricultural and Resource Economics Society (NZARES) Conference*. Blenheim, New Zealand.</w:t>
+      </w:r>
+    </w:p>
+    <w:p>
+      <w:pPr>
+        <w:pStyle w:val="ListBullet"/>
+        <w:ind w:firstLine="0"/>
+      </w:pPr>
+      <w:r>
+        <w:rPr>
+          <w:rFonts w:ascii="바탕" w:hAnsi="바탕" w:eastAsia="바탕"/>
+          <w:b w:val="0"/>
+          <w:sz w:val="22"/>
+        </w:rPr>
+        <w:t>Lundberg, S. M. &amp; Lee, S.-I. (2017). A unified approach to interpreting model predictions. In *Advances in Neural Information Processing Systems* 30 (pp. 4765-4774).</w:t>
+      </w:r>
+    </w:p>
+    <w:p>
+      <w:pPr>
+        <w:pStyle w:val="ListBullet"/>
+        <w:ind w:firstLine="0"/>
+      </w:pPr>
+      <w:r>
+        <w:rPr>
+          <w:rFonts w:ascii="바탕" w:hAnsi="바탕" w:eastAsia="바탕"/>
+          <w:b w:val="0"/>
+          <w:sz w:val="22"/>
+        </w:rPr>
+        <w:t>Lundberg, S. M., Erion, G., Chen, H., DeGrave, A., Prutkin, J. M., Nair, B., Katz, R., Himmelfarb, J., Bansal, N. &amp; Lee, S.-I. (2020). From local explanations to global understanding with explainable AI for trees. *Nature Machine Intelligence*, 2(1), 56-67.</w:t>
+      </w:r>
+    </w:p>
+    <w:p>
+      <w:pPr>
+        <w:pStyle w:val="ListBullet"/>
+        <w:ind w:firstLine="0"/>
+      </w:pPr>
+      <w:r>
+        <w:rPr>
+          <w:rFonts w:ascii="바탕" w:hAnsi="바탕" w:eastAsia="바탕"/>
+          <w:b w:val="0"/>
+          <w:sz w:val="22"/>
+        </w:rPr>
+        <w:t>Mora-García, R. T., Cespedes-Lopez, M. F. &amp; Pérez-Sánchez, V. R. (2022). Housing price prediction using machine learning algorithms in COVID-19 times. *Land*, 11(11), 2100.</w:t>
+      </w:r>
+    </w:p>
+    <w:p>
+      <w:pPr>
+        <w:pStyle w:val="ListBullet"/>
+        <w:ind w:firstLine="0"/>
+      </w:pPr>
+      <w:r>
+        <w:rPr>
+          <w:rFonts w:ascii="바탕" w:hAnsi="바탕" w:eastAsia="바탕"/>
+          <w:b w:val="0"/>
+          <w:sz w:val="22"/>
+        </w:rPr>
+        <w:t>Neves, F. T., Aparicio, M. &amp; de Castro Neto, M. (2024). The impacts of open data and explainable AI on real estate price predictions in smart cities. *Applied Sciences*, 14(5), 2209.</w:t>
+      </w:r>
+    </w:p>
+    <w:p>
+      <w:pPr>
+        <w:pStyle w:val="ListBullet"/>
+        <w:ind w:firstLine="0"/>
+      </w:pPr>
+      <w:r>
+        <w:rPr>
+          <w:rFonts w:ascii="바탕" w:hAnsi="바탕" w:eastAsia="바탕"/>
+          <w:b w:val="0"/>
+          <w:sz w:val="22"/>
+        </w:rPr>
+        <w:t>Ezil Sam Leni, A., Revathi, T. &amp; Devarajan, S. (2025). A robust ensemble-based framework for house price estimation: Integrating XG-Boost with SHAP and web deployment. *ITM Web of Conferences*, 79, 01023.</w:t>
+      </w:r>
+    </w:p>
+    <w:p>
+      <w:pPr>
+        <w:pStyle w:val="ListBullet"/>
+        <w:ind w:firstLine="0"/>
+      </w:pPr>
+      <w:r>
+        <w:rPr>
+          <w:rFonts w:ascii="바탕" w:hAnsi="바탕" w:eastAsia="바탕"/>
+          <w:b w:val="0"/>
+          <w:sz w:val="22"/>
+        </w:rPr>
+        <w:t>Ribeiro, M. T., Singh, S. &amp; Guestrin, C. (2016). "Why should I trust you?": Explaining the predictions of any classifier. In *Proceedings of the 22nd ACM SIGKDD International Conference on Knowledge Discovery and Data Mining* (pp. 1135-1144).</w:t>
+      </w:r>
+    </w:p>
+    <w:p>
+      <w:pPr>
+        <w:pStyle w:val="ListBullet"/>
+        <w:ind w:firstLine="0"/>
+      </w:pPr>
+      <w:r>
+        <w:rPr>
+          <w:rFonts w:ascii="바탕" w:hAnsi="바탕" w:eastAsia="바탕"/>
+          <w:b w:val="0"/>
+          <w:sz w:val="22"/>
+        </w:rPr>
+        <w:t>Rosen, S. (1974). Hedonic prices and implicit markets: Product differentiation in pure competition. *Journal of Political Economy*, 82(1), 34-55.</w:t>
+      </w:r>
+    </w:p>
+    <w:p>
+      <w:pPr>
+        <w:pStyle w:val="ListBullet"/>
+        <w:ind w:firstLine="0"/>
+      </w:pPr>
+      <w:r>
+        <w:rPr>
+          <w:rFonts w:ascii="바탕" w:hAnsi="바탕" w:eastAsia="바탕"/>
+          <w:b w:val="0"/>
+          <w:sz w:val="22"/>
+        </w:rPr>
+        <w:t>Shahhosseini, M., Hu, G. &amp; Pham, H. (2022). Optimizing ensemble weights and hyperparameters of machine learning models for regression problems. *Machine Learning with Applications*, 7, 100251.</w:t>
+      </w:r>
+    </w:p>
+    <w:p>
+      <w:pPr>
+        <w:pStyle w:val="ListBullet"/>
+        <w:ind w:firstLine="0"/>
+      </w:pPr>
+      <w:r>
+        <w:rPr>
+          <w:rFonts w:ascii="바탕" w:hAnsi="바탕" w:eastAsia="바탕"/>
+          <w:b w:val="0"/>
+          <w:sz w:val="22"/>
+        </w:rPr>
+        <w:t>Tarasov, S. &amp; Dessoulavy-Śliwiński, B. (2025). Algorithm-driven hedonic real estate pricing – an explainable AI approach. *Real Estate Management and Valuation*, 33(1), 22-34.</w:t>
+      </w:r>
+    </w:p>
+    <w:p>
+      <w:r>
+        <w:br w:type="page"/>
+      </w:r>
+    </w:p>
+    <w:p>
+      <w:pPr>
+        <w:pStyle w:val="Heading1"/>
         <w:spacing w:before="480" w:after="360"/>
         <w:ind w:firstLine="0"/>
         <w:jc w:val="center"/>
@@ -26439,6 +26710,7 @@
     </w:p>
     <w:p>
       <w:pPr>
+        <w:pStyle w:val="Heading2"/>
         <w:spacing w:before="360" w:after="240"/>
         <w:ind w:firstLine="0"/>
         <w:jc w:val="left"/>

</xml_diff>